<commit_message>
fix: update multimedia appendices for HITL-KG and Validated Query Triples
Appendix 1:
- Add context connecting AMAM stages to Three-Pillar Rubric
- Add HIMSS reference list (JMIR requires per-appendix references)

Appendix 2:
- Restructure as Validated Query Triple examples (NL Intent + SQL +
  Rationale Metadata) instead of bare SQL queries
- Add explanatory section on how triples preserve institutional knowledge
- Add CMS and NCQA reference list
- Update captions to reference HITL-KG

Refs #506

Co-Authored-By: Claude Opus 4.6 (1M context) <noreply@anthropic.com>
</commit_message>
<xml_diff>
--- a/multimedia_appendix_1.docx
+++ b/multimedia_appendix_1.docx
@@ -52,7 +52,7 @@
         </w:p>
       </w:sdtContent>
     </w:sdt>
-    <w:bookmarkStart w:id="10" w:name="multimedia-appendix-1"/>
+    <w:bookmarkStart w:id="11" w:name="multimedia-appendix-1"/>
     <w:p>
       <w:pPr>
         <w:pStyle w:val="Heading1"/>
@@ -68,6 +68,14 @@
       </w:pPr>
       <w:r>
         <w:t xml:space="preserve">HIMSS Analytics Maturity Assessment Model (AMAM) Stages</w:t>
+      </w:r>
+    </w:p>
+    <w:p>
+      <w:pPr>
+        <w:pStyle w:val="FirstParagraph"/>
+      </w:pPr>
+      <w:r>
+        <w:t xml:space="preserve">The HITL-KG framework’s Three-Pillar Assessment Rubric (Table 2 in the main paper) uses HIMSS AMAM stages as one indicator of Analytics Maturity. This appendix provides the full stage definitions.</w:t>
       </w:r>
     </w:p>
     <w:tbl>
@@ -538,7 +546,29 @@
       </w:tr>
     </w:tbl>
     <w:bookmarkEnd w:id="9"/>
+    <w:bookmarkStart w:id="10" w:name="references"/>
+    <w:p>
+      <w:pPr>
+        <w:pStyle w:val="Heading2"/>
+      </w:pPr>
+      <w:r>
+        <w:t xml:space="preserve">References</w:t>
+      </w:r>
+    </w:p>
+    <w:p>
+      <w:pPr>
+        <w:pStyle w:val="Compact"/>
+        <w:numPr>
+          <w:ilvl w:val="0"/>
+          <w:numId w:val="1001"/>
+        </w:numPr>
+      </w:pPr>
+      <w:r>
+        <w:t xml:space="preserve">Healthcare Information and Management Systems Society (HIMSS). Analytics maturity assessment model (AMAM) global report. HIMSS Analytics; 2024. Available from: https://www.himss.org/maturity-models/amam/</w:t>
+      </w:r>
+    </w:p>
     <w:bookmarkEnd w:id="10"/>
+    <w:bookmarkEnd w:id="11"/>
     <w:sectPr>
       <w:footnotePr>
         <w:numRestart w:val="eachSect"/>
@@ -649,8 +679,123 @@
       </w:pPr>
     </w:lvl>
   </w:abstractNum>
+  <w:abstractNum w:abstractNumId="99411">
+    <w:nsid w:val="00A99411"/>
+    <w:multiLevelType w:val="multilevel"/>
+    <w:lvl w:ilvl="0">
+      <w:start w:val="1"/>
+      <w:numFmt w:val="decimal"/>
+      <w:lvlText w:val="%1."/>
+      <w:lvlJc w:val="left"/>
+      <w:pPr>
+        <w:ind w:left="720" w:hanging="360"/>
+      </w:pPr>
+    </w:lvl>
+    <w:lvl w:ilvl="1">
+      <w:start w:val="1"/>
+      <w:numFmt w:val="decimal"/>
+      <w:lvlText w:val="%2."/>
+      <w:lvlJc w:val="left"/>
+      <w:pPr>
+        <w:ind w:left="1440" w:hanging="360"/>
+      </w:pPr>
+    </w:lvl>
+    <w:lvl w:ilvl="2">
+      <w:start w:val="1"/>
+      <w:numFmt w:val="decimal"/>
+      <w:lvlText w:val="%3."/>
+      <w:lvlJc w:val="left"/>
+      <w:pPr>
+        <w:ind w:left="2160" w:hanging="360"/>
+      </w:pPr>
+    </w:lvl>
+    <w:lvl w:ilvl="3">
+      <w:start w:val="1"/>
+      <w:numFmt w:val="decimal"/>
+      <w:lvlText w:val="%4."/>
+      <w:lvlJc w:val="left"/>
+      <w:pPr>
+        <w:ind w:left="2880" w:hanging="360"/>
+      </w:pPr>
+    </w:lvl>
+    <w:lvl w:ilvl="4">
+      <w:start w:val="1"/>
+      <w:numFmt w:val="decimal"/>
+      <w:lvlText w:val="%5."/>
+      <w:lvlJc w:val="left"/>
+      <w:pPr>
+        <w:ind w:left="3600" w:hanging="360"/>
+      </w:pPr>
+    </w:lvl>
+    <w:lvl w:ilvl="5">
+      <w:start w:val="1"/>
+      <w:numFmt w:val="decimal"/>
+      <w:lvlText w:val="%6."/>
+      <w:lvlJc w:val="left"/>
+      <w:pPr>
+        <w:ind w:left="4320" w:hanging="360"/>
+      </w:pPr>
+    </w:lvl>
+    <w:lvl w:ilvl="6">
+      <w:start w:val="1"/>
+      <w:numFmt w:val="decimal"/>
+      <w:lvlText w:val="%7."/>
+      <w:lvlJc w:val="left"/>
+      <w:pPr>
+        <w:ind w:left="5040" w:hanging="360"/>
+      </w:pPr>
+    </w:lvl>
+    <w:lvl w:ilvl="7">
+      <w:start w:val="1"/>
+      <w:numFmt w:val="decimal"/>
+      <w:lvlText w:val="%8."/>
+      <w:lvlJc w:val="left"/>
+      <w:pPr>
+        <w:ind w:left="5760" w:hanging="360"/>
+      </w:pPr>
+    </w:lvl>
+    <w:lvl w:ilvl="8">
+      <w:start w:val="1"/>
+      <w:numFmt w:val="decimal"/>
+      <w:lvlText w:val="%9."/>
+      <w:lvlJc w:val="left"/>
+      <w:pPr>
+        <w:ind w:left="6480" w:hanging="360"/>
+      </w:pPr>
+    </w:lvl>
+  </w:abstractNum>
   <w:num w:numId="1000">
     <w:abstractNumId w:val="990"/>
+  </w:num>
+  <w:num w:numId="1001">
+    <w:abstractNumId w:val="99411"/>
+    <w:lvlOverride w:ilvl="0">
+      <w:startOverride w:val="1"/>
+    </w:lvlOverride>
+    <w:lvlOverride w:ilvl="1">
+      <w:startOverride w:val="1"/>
+    </w:lvlOverride>
+    <w:lvlOverride w:ilvl="2">
+      <w:startOverride w:val="1"/>
+    </w:lvlOverride>
+    <w:lvlOverride w:ilvl="3">
+      <w:startOverride w:val="1"/>
+    </w:lvlOverride>
+    <w:lvlOverride w:ilvl="4">
+      <w:startOverride w:val="1"/>
+    </w:lvlOverride>
+    <w:lvlOverride w:ilvl="5">
+      <w:startOverride w:val="1"/>
+    </w:lvlOverride>
+    <w:lvlOverride w:ilvl="6">
+      <w:startOverride w:val="1"/>
+    </w:lvlOverride>
+    <w:lvlOverride w:ilvl="7">
+      <w:startOverride w:val="1"/>
+    </w:lvlOverride>
+    <w:lvlOverride w:ilvl="8">
+      <w:startOverride w:val="1"/>
+    </w:lvlOverride>
   </w:num>
 </w:numbering>
 </file>

</xml_diff>

<commit_message>
fix: delete AMAM appendix, renumber VQT appendix, add body reference
- Delete Multimedia Appendix 1 (AMAM stages): derivative content
  freely available from HIMSS, no original value
- Renumber Multimedia Appendix 2 (Validated Query Triples) to
  Appendix 1
- Add "(see Multimedia Appendix 1 for worked examples)" where
  Validated Query Triple is defined in Section 2.2
- Update submission checklist

Refs #506

Co-Authored-By: Claude Opus 4.6 (1M context) <noreply@anthropic.com>
</commit_message>
<xml_diff>
--- a/multimedia_appendix_1.docx
+++ b/multimedia_appendix_1.docx
@@ -52,7 +52,7 @@
         </w:p>
       </w:sdtContent>
     </w:sdt>
-    <w:bookmarkStart w:id="11" w:name="multimedia-appendix-1"/>
+    <w:bookmarkStart w:id="15" w:name="multimedia-appendix-1"/>
     <w:p>
       <w:pPr>
         <w:pStyle w:val="Heading1"/>
@@ -61,13 +61,13 @@
         <w:t xml:space="preserve">Multimedia Appendix 1</w:t>
       </w:r>
     </w:p>
-    <w:bookmarkStart w:id="9" w:name="X9f53f22171f41c75ba70869e293df97768fb2d4"/>
+    <w:bookmarkStart w:id="12" w:name="X9f1943a7ce7630e7300cf38f4e99b0060e62518"/>
     <w:p>
       <w:pPr>
         <w:pStyle w:val="Heading2"/>
       </w:pPr>
       <w:r>
-        <w:t xml:space="preserve">HIMSS Analytics Maturity Assessment Model (AMAM) Stages</w:t>
+        <w:t xml:space="preserve">Validated Query Triple Examples for Healthcare Analytics</w:t>
       </w:r>
     </w:p>
     <w:p>
@@ -75,478 +75,1984 @@
         <w:pStyle w:val="FirstParagraph"/>
       </w:pPr>
       <w:r>
-        <w:t xml:space="preserve">The HITL-KG framework’s Three-Pillar Assessment Rubric (Table 2 in the main paper) uses HIMSS AMAM stages as one indicator of Analytics Maturity. This appendix provides the full stage definitions.</w:t>
+        <w:t xml:space="preserve">This appendix illustrates the Validated Query Triple artifact proposed by the HITL-KG framework (see Section 2.2 of the main paper). Each triple comprises three components: (1)</w:t>
+      </w:r>
+      <w:r>
+        <w:t xml:space="preserve"> </w:t>
+      </w:r>
+      <w:r>
+        <w:rPr>
+          <w:b/>
+          <w:bCs/>
+        </w:rPr>
+        <w:t xml:space="preserve">Natural Language Intent</w:t>
+      </w:r>
+      <w:r>
+        <w:t xml:space="preserve">, the clinical business question; (2)</w:t>
+      </w:r>
+      <w:r>
+        <w:t xml:space="preserve"> </w:t>
+      </w:r>
+      <w:r>
+        <w:rPr>
+          <w:b/>
+          <w:bCs/>
+        </w:rPr>
+        <w:t xml:space="preserve">Executable SQL</w:t>
+      </w:r>
+      <w:r>
+        <w:t xml:space="preserve">, the technical implementation; and (3)</w:t>
+      </w:r>
+      <w:r>
+        <w:t xml:space="preserve"> </w:t>
+      </w:r>
+      <w:r>
+        <w:rPr>
+          <w:b/>
+          <w:bCs/>
+        </w:rPr>
+        <w:t xml:space="preserve">Rationale Metadata</w:t>
+      </w:r>
+      <w:r>
+        <w:t xml:space="preserve">, the contextual</w:t>
+      </w:r>
+      <w:r>
+        <w:t xml:space="preserve"> </w:t>
+      </w:r>
+      <w:r>
+        <w:t xml:space="preserve">“why”</w:t>
+      </w:r>
+      <w:r>
+        <w:t xml:space="preserve"> </w:t>
+      </w:r>
+      <w:r>
+        <w:t xml:space="preserve">behind the logic. Together, these components capture not just</w:t>
+      </w:r>
+      <w:r>
+        <w:t xml:space="preserve"> </w:t>
+      </w:r>
+      <w:r>
+        <w:rPr>
+          <w:i/>
+          <w:iCs/>
+        </w:rPr>
+        <w:t xml:space="preserve">what</w:t>
+      </w:r>
+      <w:r>
+        <w:t xml:space="preserve"> </w:t>
+      </w:r>
+      <w:r>
+        <w:t xml:space="preserve">query was run but</w:t>
+      </w:r>
+      <w:r>
+        <w:t xml:space="preserve"> </w:t>
+      </w:r>
+      <w:r>
+        <w:rPr>
+          <w:i/>
+          <w:iCs/>
+        </w:rPr>
+        <w:t xml:space="preserve">why</w:t>
+      </w:r>
+      <w:r>
+        <w:t xml:space="preserve"> </w:t>
+      </w:r>
+      <w:r>
+        <w:t xml:space="preserve">it was constructed that way, preserving institutional knowledge that would otherwise be lost during staff turnover.</w:t>
       </w:r>
     </w:p>
-    <w:tbl>
-      <w:tblPr>
-        <w:tblStyle w:val="Table"/>
-        <w:tblW w:type="pct" w:w="5000"/>
-        <w:tblLayout w:type="fixed"/>
-        <w:tblLook w:firstRow="1" w:lastRow="0" w:firstColumn="0" w:lastColumn="0" w:noHBand="0" w:noVBand="0" w:val="0020"/>
-      </w:tblPr>
-      <w:tblGrid>
-        <w:gridCol w:w="1980"/>
-        <w:gridCol w:w="1980"/>
-        <w:gridCol w:w="1980"/>
-        <w:gridCol w:w="1980"/>
-      </w:tblGrid>
-      <w:tr>
-        <w:trPr>
-          <w:tblHeader w:val="on"/>
-        </w:trPr>
-        <w:tc>
-          <w:tcPr/>
-          <w:p>
-            <w:pPr>
-              <w:pStyle w:val="Compact"/>
-              <w:jc w:val="left"/>
-            </w:pPr>
-            <w:r>
-              <w:t xml:space="preserve">Stage</w:t>
-            </w:r>
-          </w:p>
-        </w:tc>
-        <w:tc>
-          <w:tcPr/>
-          <w:p>
-            <w:pPr>
-              <w:pStyle w:val="Compact"/>
-              <w:jc w:val="left"/>
-            </w:pPr>
-            <w:r>
-              <w:t xml:space="preserve">Name</w:t>
-            </w:r>
-          </w:p>
-        </w:tc>
-        <w:tc>
-          <w:tcPr/>
-          <w:p>
-            <w:pPr>
-              <w:pStyle w:val="Compact"/>
-              <w:jc w:val="left"/>
-            </w:pPr>
-            <w:r>
-              <w:t xml:space="preserve">Description</w:t>
-            </w:r>
-          </w:p>
-        </w:tc>
-        <w:tc>
-          <w:tcPr/>
-          <w:p>
-            <w:pPr>
-              <w:pStyle w:val="Compact"/>
-              <w:jc w:val="left"/>
-            </w:pPr>
-            <w:r>
-              <w:t xml:space="preserve">Key Capabilities</w:t>
-            </w:r>
-          </w:p>
-        </w:tc>
-      </w:tr>
-      <w:tr>
-        <w:tc>
-          <w:tcPr/>
-          <w:p>
-            <w:pPr>
-              <w:pStyle w:val="Compact"/>
-              <w:jc w:val="left"/>
-            </w:pPr>
-            <w:r>
-              <w:t xml:space="preserve">Stage 0</w:t>
-            </w:r>
-          </w:p>
-        </w:tc>
-        <w:tc>
-          <w:tcPr/>
-          <w:p>
-            <w:pPr>
-              <w:pStyle w:val="Compact"/>
-              <w:jc w:val="left"/>
-            </w:pPr>
-            <w:r>
-              <w:t xml:space="preserve">Data Collection</w:t>
-            </w:r>
-          </w:p>
-        </w:tc>
-        <w:tc>
-          <w:tcPr/>
-          <w:p>
-            <w:pPr>
-              <w:pStyle w:val="Compact"/>
-              <w:jc w:val="left"/>
-            </w:pPr>
-            <w:r>
-              <w:t xml:space="preserve">Basic data capture without integration</w:t>
-            </w:r>
-          </w:p>
-        </w:tc>
-        <w:tc>
-          <w:tcPr/>
-          <w:p>
-            <w:pPr>
-              <w:pStyle w:val="Compact"/>
-              <w:jc w:val="left"/>
-            </w:pPr>
-            <w:r>
-              <w:t xml:space="preserve">Manual data entry, paper records</w:t>
-            </w:r>
-          </w:p>
-        </w:tc>
-      </w:tr>
-      <w:tr>
-        <w:tc>
-          <w:tcPr/>
-          <w:p>
-            <w:pPr>
-              <w:pStyle w:val="Compact"/>
-              <w:jc w:val="left"/>
-            </w:pPr>
-            <w:r>
-              <w:t xml:space="preserve">Stage 1</w:t>
-            </w:r>
-          </w:p>
-        </w:tc>
-        <w:tc>
-          <w:tcPr/>
-          <w:p>
-            <w:pPr>
-              <w:pStyle w:val="Compact"/>
-              <w:jc w:val="left"/>
-            </w:pPr>
-            <w:r>
-              <w:t xml:space="preserve">Data Verification</w:t>
-            </w:r>
-          </w:p>
-        </w:tc>
-        <w:tc>
-          <w:tcPr/>
-          <w:p>
-            <w:pPr>
-              <w:pStyle w:val="Compact"/>
-              <w:jc w:val="left"/>
-            </w:pPr>
-            <w:r>
-              <w:t xml:space="preserve">Automated data validation and error checking</w:t>
-            </w:r>
-          </w:p>
-        </w:tc>
-        <w:tc>
-          <w:tcPr/>
-          <w:p>
-            <w:pPr>
-              <w:pStyle w:val="Compact"/>
-              <w:jc w:val="left"/>
-            </w:pPr>
-            <w:r>
-              <w:t xml:space="preserve">Basic quality controls, automated checks</w:t>
-            </w:r>
-          </w:p>
-        </w:tc>
-      </w:tr>
-      <w:tr>
-        <w:tc>
-          <w:tcPr/>
-          <w:p>
-            <w:pPr>
-              <w:pStyle w:val="Compact"/>
-              <w:jc w:val="left"/>
-            </w:pPr>
-            <w:r>
-              <w:t xml:space="preserve">Stage 2</w:t>
-            </w:r>
-          </w:p>
-        </w:tc>
-        <w:tc>
-          <w:tcPr/>
-          <w:p>
-            <w:pPr>
-              <w:pStyle w:val="Compact"/>
-              <w:jc w:val="left"/>
-            </w:pPr>
-            <w:r>
-              <w:t xml:space="preserve">Data Utilization</w:t>
-            </w:r>
-          </w:p>
-        </w:tc>
-        <w:tc>
-          <w:tcPr/>
-          <w:p>
-            <w:pPr>
-              <w:pStyle w:val="Compact"/>
-              <w:jc w:val="left"/>
-            </w:pPr>
-            <w:r>
-              <w:t xml:space="preserve">Standard reporting and basic analytics</w:t>
-            </w:r>
-          </w:p>
-        </w:tc>
-        <w:tc>
-          <w:tcPr/>
-          <w:p>
-            <w:pPr>
-              <w:pStyle w:val="Compact"/>
-              <w:jc w:val="left"/>
-            </w:pPr>
-            <w:r>
-              <w:t xml:space="preserve">Automated reports, dashboard creation</w:t>
-            </w:r>
-          </w:p>
-        </w:tc>
-      </w:tr>
-      <w:tr>
-        <w:tc>
-          <w:tcPr/>
-          <w:p>
-            <w:pPr>
-              <w:pStyle w:val="Compact"/>
-              <w:jc w:val="left"/>
-            </w:pPr>
-            <w:r>
-              <w:t xml:space="preserve">Stage 3</w:t>
-            </w:r>
-          </w:p>
-        </w:tc>
-        <w:tc>
-          <w:tcPr/>
-          <w:p>
-            <w:pPr>
-              <w:pStyle w:val="Compact"/>
-              <w:jc w:val="left"/>
-            </w:pPr>
-            <w:r>
-              <w:t xml:space="preserve">Automated Decision Support</w:t>
-            </w:r>
-          </w:p>
-        </w:tc>
-        <w:tc>
-          <w:tcPr/>
-          <w:p>
-            <w:pPr>
-              <w:pStyle w:val="Compact"/>
-              <w:jc w:val="left"/>
-            </w:pPr>
-            <w:r>
-              <w:t xml:space="preserve">Rule-based clinical and operational support</w:t>
-            </w:r>
-          </w:p>
-        </w:tc>
-        <w:tc>
-          <w:tcPr/>
-          <w:p>
-            <w:pPr>
-              <w:pStyle w:val="Compact"/>
-              <w:jc w:val="left"/>
-            </w:pPr>
-            <w:r>
-              <w:t xml:space="preserve">Clinical alerts, automated protocols</w:t>
-            </w:r>
-          </w:p>
-        </w:tc>
-      </w:tr>
-      <w:tr>
-        <w:tc>
-          <w:tcPr/>
-          <w:p>
-            <w:pPr>
-              <w:pStyle w:val="Compact"/>
-              <w:jc w:val="left"/>
-            </w:pPr>
-            <w:r>
-              <w:t xml:space="preserve">Stage 4</w:t>
-            </w:r>
-          </w:p>
-        </w:tc>
-        <w:tc>
-          <w:tcPr/>
-          <w:p>
-            <w:pPr>
-              <w:pStyle w:val="Compact"/>
-              <w:jc w:val="left"/>
-            </w:pPr>
-            <w:r>
-              <w:t xml:space="preserve">Population Health Analytics</w:t>
-            </w:r>
-          </w:p>
-        </w:tc>
-        <w:tc>
-          <w:tcPr/>
-          <w:p>
-            <w:pPr>
-              <w:pStyle w:val="Compact"/>
-              <w:jc w:val="left"/>
-            </w:pPr>
-            <w:r>
-              <w:t xml:space="preserve">Population-level analysis and intervention</w:t>
-            </w:r>
-          </w:p>
-        </w:tc>
-        <w:tc>
-          <w:tcPr/>
-          <w:p>
-            <w:pPr>
-              <w:pStyle w:val="Compact"/>
-              <w:jc w:val="left"/>
-            </w:pPr>
-            <w:r>
-              <w:t xml:space="preserve">Cohort identification, risk stratification</w:t>
-            </w:r>
-          </w:p>
-        </w:tc>
-      </w:tr>
-      <w:tr>
-        <w:tc>
-          <w:tcPr/>
-          <w:p>
-            <w:pPr>
-              <w:pStyle w:val="Compact"/>
-              <w:jc w:val="left"/>
-            </w:pPr>
-            <w:r>
-              <w:t xml:space="preserve">Stage 5</w:t>
-            </w:r>
-          </w:p>
-        </w:tc>
-        <w:tc>
-          <w:tcPr/>
-          <w:p>
-            <w:pPr>
-              <w:pStyle w:val="Compact"/>
-              <w:jc w:val="left"/>
-            </w:pPr>
-            <w:r>
-              <w:t xml:space="preserve">Predictive Analytics</w:t>
-            </w:r>
-          </w:p>
-        </w:tc>
-        <w:tc>
-          <w:tcPr/>
-          <w:p>
-            <w:pPr>
-              <w:pStyle w:val="Compact"/>
-              <w:jc w:val="left"/>
-            </w:pPr>
-            <w:r>
-              <w:t xml:space="preserve">Statistical modeling and predictive capabilities</w:t>
-            </w:r>
-          </w:p>
-        </w:tc>
-        <w:tc>
-          <w:tcPr/>
-          <w:p>
-            <w:pPr>
-              <w:pStyle w:val="Compact"/>
-              <w:jc w:val="left"/>
-            </w:pPr>
-            <w:r>
-              <w:t xml:space="preserve">Predictive models, trend analysis</w:t>
-            </w:r>
-          </w:p>
-        </w:tc>
-      </w:tr>
-      <w:tr>
-        <w:tc>
-          <w:tcPr/>
-          <w:p>
-            <w:pPr>
-              <w:pStyle w:val="Compact"/>
-              <w:jc w:val="left"/>
-            </w:pPr>
-            <w:r>
-              <w:t xml:space="preserve">Stage 6</w:t>
-            </w:r>
-          </w:p>
-        </w:tc>
-        <w:tc>
-          <w:tcPr/>
-          <w:p>
-            <w:pPr>
-              <w:pStyle w:val="Compact"/>
-              <w:jc w:val="left"/>
-            </w:pPr>
-            <w:r>
-              <w:t xml:space="preserve">Cognitive Analytics</w:t>
-            </w:r>
-          </w:p>
-        </w:tc>
-        <w:tc>
-          <w:tcPr/>
-          <w:p>
-            <w:pPr>
-              <w:pStyle w:val="Compact"/>
-              <w:jc w:val="left"/>
-            </w:pPr>
-            <w:r>
-              <w:t xml:space="preserve">Machine learning and AI integration</w:t>
-            </w:r>
-          </w:p>
-        </w:tc>
-        <w:tc>
-          <w:tcPr/>
-          <w:p>
-            <w:pPr>
-              <w:pStyle w:val="Compact"/>
-              <w:jc w:val="left"/>
-            </w:pPr>
-            <w:r>
-              <w:t xml:space="preserve">Advanced AI, pattern recognition</w:t>
-            </w:r>
-          </w:p>
-        </w:tc>
-      </w:tr>
-      <w:tr>
-        <w:tc>
-          <w:tcPr/>
-          <w:p>
-            <w:pPr>
-              <w:pStyle w:val="Compact"/>
-              <w:jc w:val="left"/>
-            </w:pPr>
-            <w:r>
-              <w:t xml:space="preserve">Stage 7</w:t>
-            </w:r>
-          </w:p>
-        </w:tc>
-        <w:tc>
-          <w:tcPr/>
-          <w:p>
-            <w:pPr>
-              <w:pStyle w:val="Compact"/>
-              <w:jc w:val="left"/>
-            </w:pPr>
-            <w:r>
-              <w:t xml:space="preserve">Precision Medicine</w:t>
-            </w:r>
-          </w:p>
-        </w:tc>
-        <w:tc>
-          <w:tcPr/>
-          <w:p>
-            <w:pPr>
-              <w:pStyle w:val="Compact"/>
-              <w:jc w:val="left"/>
-            </w:pPr>
-            <w:r>
-              <w:t xml:space="preserve">Personalized treatment and genomic integration</w:t>
-            </w:r>
-          </w:p>
-        </w:tc>
-        <w:tc>
-          <w:tcPr/>
-          <w:p>
-            <w:pPr>
-              <w:pStyle w:val="Compact"/>
-              <w:jc w:val="left"/>
-            </w:pPr>
-            <w:r>
-              <w:t xml:space="preserve">Personalized care, genomic analytics</w:t>
-            </w:r>
-          </w:p>
-        </w:tc>
-      </w:tr>
-    </w:tbl>
+    <w:p>
+      <w:r>
+        <w:pict>
+          <v:rect style="width:0;height:1.5pt" o:hralign="center" o:hrstd="t" o:hr="t"/>
+        </w:pict>
+      </w:r>
+    </w:p>
+    <w:bookmarkStart w:id="9" w:name="triple-1-diabetes-care-monitoring"/>
+    <w:p>
+      <w:pPr>
+        <w:pStyle w:val="Heading3"/>
+      </w:pPr>
+      <w:r>
+        <w:t xml:space="preserve">Triple 1: Diabetes Care Monitoring</w:t>
+      </w:r>
+    </w:p>
+    <w:p>
+      <w:pPr>
+        <w:pStyle w:val="FirstParagraph"/>
+      </w:pPr>
+      <w:r>
+        <w:rPr>
+          <w:b/>
+          <w:bCs/>
+        </w:rPr>
+        <w:t xml:space="preserve">Natural Language Intent:</w:t>
+      </w:r>
+      <w:r>
+        <w:t xml:space="preserve"> </w:t>
+      </w:r>
+      <w:r>
+        <w:t xml:space="preserve">“Show me all diabetic patients over 65 who had an HbA1c test in the last 6 months”</w:t>
+      </w:r>
+    </w:p>
+    <w:p>
+      <w:pPr>
+        <w:pStyle w:val="BodyText"/>
+      </w:pPr>
+      <w:r>
+        <w:rPr>
+          <w:b/>
+          <w:bCs/>
+        </w:rPr>
+        <w:t xml:space="preserve">Executable SQL:</w:t>
+      </w:r>
+    </w:p>
+    <w:p>
+      <w:pPr>
+        <w:pStyle w:val="SourceCode"/>
+      </w:pPr>
+      <w:r>
+        <w:rPr>
+          <w:rStyle w:val="KeywordTok"/>
+        </w:rPr>
+        <w:t xml:space="preserve">SELECT</w:t>
+      </w:r>
+      <w:r>
+        <w:rPr>
+          <w:rStyle w:val="NormalTok"/>
+        </w:rPr>
+        <w:t xml:space="preserve"> p.patient_id, p.age, l.test_date, l.result_value</w:t>
+      </w:r>
+      <w:r>
+        <w:br/>
+      </w:r>
+      <w:r>
+        <w:rPr>
+          <w:rStyle w:val="KeywordTok"/>
+        </w:rPr>
+        <w:t xml:space="preserve">FROM</w:t>
+      </w:r>
+      <w:r>
+        <w:rPr>
+          <w:rStyle w:val="NormalTok"/>
+        </w:rPr>
+        <w:t xml:space="preserve"> patients p</w:t>
+      </w:r>
+      <w:r>
+        <w:br/>
+      </w:r>
+      <w:r>
+        <w:rPr>
+          <w:rStyle w:val="KeywordTok"/>
+        </w:rPr>
+        <w:t xml:space="preserve">JOIN</w:t>
+      </w:r>
+      <w:r>
+        <w:rPr>
+          <w:rStyle w:val="NormalTok"/>
+        </w:rPr>
+        <w:t xml:space="preserve"> lab_results l </w:t>
+      </w:r>
+      <w:r>
+        <w:rPr>
+          <w:rStyle w:val="KeywordTok"/>
+        </w:rPr>
+        <w:t xml:space="preserve">ON</w:t>
+      </w:r>
+      <w:r>
+        <w:rPr>
+          <w:rStyle w:val="NormalTok"/>
+        </w:rPr>
+        <w:t xml:space="preserve"> p.patient_id </w:t>
+      </w:r>
+      <w:r>
+        <w:rPr>
+          <w:rStyle w:val="OperatorTok"/>
+        </w:rPr>
+        <w:t xml:space="preserve">=</w:t>
+      </w:r>
+      <w:r>
+        <w:rPr>
+          <w:rStyle w:val="NormalTok"/>
+        </w:rPr>
+        <w:t xml:space="preserve"> l.patient_id</w:t>
+      </w:r>
+      <w:r>
+        <w:br/>
+      </w:r>
+      <w:r>
+        <w:rPr>
+          <w:rStyle w:val="KeywordTok"/>
+        </w:rPr>
+        <w:t xml:space="preserve">JOIN</w:t>
+      </w:r>
+      <w:r>
+        <w:rPr>
+          <w:rStyle w:val="NormalTok"/>
+        </w:rPr>
+        <w:t xml:space="preserve"> diagnoses d </w:t>
+      </w:r>
+      <w:r>
+        <w:rPr>
+          <w:rStyle w:val="KeywordTok"/>
+        </w:rPr>
+        <w:t xml:space="preserve">ON</w:t>
+      </w:r>
+      <w:r>
+        <w:rPr>
+          <w:rStyle w:val="NormalTok"/>
+        </w:rPr>
+        <w:t xml:space="preserve"> p.patient_id </w:t>
+      </w:r>
+      <w:r>
+        <w:rPr>
+          <w:rStyle w:val="OperatorTok"/>
+        </w:rPr>
+        <w:t xml:space="preserve">=</w:t>
+      </w:r>
+      <w:r>
+        <w:rPr>
+          <w:rStyle w:val="NormalTok"/>
+        </w:rPr>
+        <w:t xml:space="preserve"> d.patient_id</w:t>
+      </w:r>
+      <w:r>
+        <w:br/>
+      </w:r>
+      <w:r>
+        <w:rPr>
+          <w:rStyle w:val="KeywordTok"/>
+        </w:rPr>
+        <w:t xml:space="preserve">WHERE</w:t>
+      </w:r>
+      <w:r>
+        <w:rPr>
+          <w:rStyle w:val="NormalTok"/>
+        </w:rPr>
+        <w:t xml:space="preserve"> d.icd10_code </w:t>
+      </w:r>
+      <w:r>
+        <w:rPr>
+          <w:rStyle w:val="KeywordTok"/>
+        </w:rPr>
+        <w:t xml:space="preserve">LIKE</w:t>
+      </w:r>
+      <w:r>
+        <w:rPr>
+          <w:rStyle w:val="NormalTok"/>
+        </w:rPr>
+        <w:t xml:space="preserve"> </w:t>
+      </w:r>
+      <w:r>
+        <w:rPr>
+          <w:rStyle w:val="StringTok"/>
+        </w:rPr>
+        <w:t xml:space="preserve">'E11%'</w:t>
+      </w:r>
+      <w:r>
+        <w:rPr>
+          <w:rStyle w:val="NormalTok"/>
+        </w:rPr>
+        <w:t xml:space="preserve">  </w:t>
+      </w:r>
+      <w:r>
+        <w:rPr>
+          <w:rStyle w:val="CommentTok"/>
+        </w:rPr>
+        <w:t xml:space="preserve">-- Type 2 Diabetes</w:t>
+      </w:r>
+      <w:r>
+        <w:br/>
+      </w:r>
+      <w:r>
+        <w:rPr>
+          <w:rStyle w:val="NormalTok"/>
+        </w:rPr>
+        <w:t xml:space="preserve">  </w:t>
+      </w:r>
+      <w:r>
+        <w:rPr>
+          <w:rStyle w:val="KeywordTok"/>
+        </w:rPr>
+        <w:t xml:space="preserve">AND</w:t>
+      </w:r>
+      <w:r>
+        <w:rPr>
+          <w:rStyle w:val="NormalTok"/>
+        </w:rPr>
+        <w:t xml:space="preserve"> p.age </w:t>
+      </w:r>
+      <w:r>
+        <w:rPr>
+          <w:rStyle w:val="OperatorTok"/>
+        </w:rPr>
+        <w:t xml:space="preserve">&gt;</w:t>
+      </w:r>
+      <w:r>
+        <w:rPr>
+          <w:rStyle w:val="NormalTok"/>
+        </w:rPr>
+        <w:t xml:space="preserve"> </w:t>
+      </w:r>
+      <w:r>
+        <w:rPr>
+          <w:rStyle w:val="DecValTok"/>
+        </w:rPr>
+        <w:t xml:space="preserve">65</w:t>
+      </w:r>
+      <w:r>
+        <w:br/>
+      </w:r>
+      <w:r>
+        <w:rPr>
+          <w:rStyle w:val="NormalTok"/>
+        </w:rPr>
+        <w:t xml:space="preserve">  </w:t>
+      </w:r>
+      <w:r>
+        <w:rPr>
+          <w:rStyle w:val="KeywordTok"/>
+        </w:rPr>
+        <w:t xml:space="preserve">AND</w:t>
+      </w:r>
+      <w:r>
+        <w:rPr>
+          <w:rStyle w:val="NormalTok"/>
+        </w:rPr>
+        <w:t xml:space="preserve"> l.test_name </w:t>
+      </w:r>
+      <w:r>
+        <w:rPr>
+          <w:rStyle w:val="OperatorTok"/>
+        </w:rPr>
+        <w:t xml:space="preserve">=</w:t>
+      </w:r>
+      <w:r>
+        <w:rPr>
+          <w:rStyle w:val="NormalTok"/>
+        </w:rPr>
+        <w:t xml:space="preserve"> </w:t>
+      </w:r>
+      <w:r>
+        <w:rPr>
+          <w:rStyle w:val="StringTok"/>
+        </w:rPr>
+        <w:t xml:space="preserve">'HbA1c'</w:t>
+      </w:r>
+      <w:r>
+        <w:br/>
+      </w:r>
+      <w:r>
+        <w:rPr>
+          <w:rStyle w:val="NormalTok"/>
+        </w:rPr>
+        <w:t xml:space="preserve">  </w:t>
+      </w:r>
+      <w:r>
+        <w:rPr>
+          <w:rStyle w:val="KeywordTok"/>
+        </w:rPr>
+        <w:t xml:space="preserve">AND</w:t>
+      </w:r>
+      <w:r>
+        <w:rPr>
+          <w:rStyle w:val="NormalTok"/>
+        </w:rPr>
+        <w:t xml:space="preserve"> l.test_date </w:t>
+      </w:r>
+      <w:r>
+        <w:rPr>
+          <w:rStyle w:val="OperatorTok"/>
+        </w:rPr>
+        <w:t xml:space="preserve">&gt;=</w:t>
+      </w:r>
+      <w:r>
+        <w:rPr>
+          <w:rStyle w:val="NormalTok"/>
+        </w:rPr>
+        <w:t xml:space="preserve"> DATE_SUB(</w:t>
+      </w:r>
+      <w:r>
+        <w:rPr>
+          <w:rStyle w:val="FunctionTok"/>
+        </w:rPr>
+        <w:t xml:space="preserve">CURRENT_DATE</w:t>
+      </w:r>
+      <w:r>
+        <w:rPr>
+          <w:rStyle w:val="NormalTok"/>
+        </w:rPr>
+        <w:t xml:space="preserve">, </w:t>
+      </w:r>
+      <w:r>
+        <w:rPr>
+          <w:rStyle w:val="DataTypeTok"/>
+        </w:rPr>
+        <w:t xml:space="preserve">INTERVAL</w:t>
+      </w:r>
+      <w:r>
+        <w:rPr>
+          <w:rStyle w:val="NormalTok"/>
+        </w:rPr>
+        <w:t xml:space="preserve"> </w:t>
+      </w:r>
+      <w:r>
+        <w:rPr>
+          <w:rStyle w:val="DecValTok"/>
+        </w:rPr>
+        <w:t xml:space="preserve">6</w:t>
+      </w:r>
+      <w:r>
+        <w:rPr>
+          <w:rStyle w:val="NormalTok"/>
+        </w:rPr>
+        <w:t xml:space="preserve"> </w:t>
+      </w:r>
+      <w:r>
+        <w:rPr>
+          <w:rStyle w:val="DataTypeTok"/>
+        </w:rPr>
+        <w:t xml:space="preserve">MONTH</w:t>
+      </w:r>
+      <w:r>
+        <w:rPr>
+          <w:rStyle w:val="NormalTok"/>
+        </w:rPr>
+        <w:t xml:space="preserve">)</w:t>
+      </w:r>
+    </w:p>
+    <w:p>
+      <w:pPr>
+        <w:pStyle w:val="FirstParagraph"/>
+      </w:pPr>
+      <w:r>
+        <w:rPr>
+          <w:b/>
+          <w:bCs/>
+        </w:rPr>
+        <w:t xml:space="preserve">Rationale Metadata:</w:t>
+      </w:r>
+      <w:r>
+        <w:t xml:space="preserve"> </w:t>
+      </w:r>
+      <w:r>
+        <w:t xml:space="preserve">Aligned with NCQA HEDIS measures for Comprehensive Diabetes Care (CDC), monitoring HbA1c testing compliance in older adult populations. Uses ICD-10 E11% for Type 2 Diabetes specifically (not E10% for Type 1) per organizational coding convention. Six-month window matches the HEDIS reporting period.</w:t>
+      </w:r>
+    </w:p>
+    <w:p>
+      <w:r>
+        <w:pict>
+          <v:rect style="width:0;height:1.5pt" o:hralign="center" o:hrstd="t" o:hr="t"/>
+        </w:pict>
+      </w:r>
+    </w:p>
     <w:bookmarkEnd w:id="9"/>
-    <w:bookmarkStart w:id="10" w:name="references"/>
+    <w:bookmarkStart w:id="10" w:name="X47ea3a2d2ba3aa21c6db0bd5679f45e3185d1f6"/>
+    <w:p>
+      <w:pPr>
+        <w:pStyle w:val="Heading3"/>
+      </w:pPr>
+      <w:r>
+        <w:t xml:space="preserve">Triple 2: Heart Failure Readmission Cohort</w:t>
+      </w:r>
+    </w:p>
+    <w:p>
+      <w:pPr>
+        <w:pStyle w:val="FirstParagraph"/>
+      </w:pPr>
+      <w:r>
+        <w:rPr>
+          <w:b/>
+          <w:bCs/>
+        </w:rPr>
+        <w:t xml:space="preserve">Natural Language Intent:</w:t>
+      </w:r>
+      <w:r>
+        <w:t xml:space="preserve"> </w:t>
+      </w:r>
+      <w:r>
+        <w:t xml:space="preserve">“Identify patients discharged with Heart Failure in 2024 who had a readmission within 30 days, excluding those discharged to hospice. For each, calculate their max creatinine levels during the index stay.”</w:t>
+      </w:r>
+    </w:p>
+    <w:p>
+      <w:pPr>
+        <w:pStyle w:val="BodyText"/>
+      </w:pPr>
+      <w:r>
+        <w:rPr>
+          <w:b/>
+          <w:bCs/>
+        </w:rPr>
+        <w:t xml:space="preserve">Executable SQL:</w:t>
+      </w:r>
+    </w:p>
+    <w:p>
+      <w:pPr>
+        <w:pStyle w:val="SourceCode"/>
+      </w:pPr>
+      <w:r>
+        <w:rPr>
+          <w:rStyle w:val="KeywordTok"/>
+        </w:rPr>
+        <w:t xml:space="preserve">WITH</w:t>
+      </w:r>
+      <w:r>
+        <w:rPr>
+          <w:rStyle w:val="NormalTok"/>
+        </w:rPr>
+        <w:t xml:space="preserve"> IndexAdmissions </w:t>
+      </w:r>
+      <w:r>
+        <w:rPr>
+          <w:rStyle w:val="KeywordTok"/>
+        </w:rPr>
+        <w:t xml:space="preserve">AS</w:t>
+      </w:r>
+      <w:r>
+        <w:rPr>
+          <w:rStyle w:val="NormalTok"/>
+        </w:rPr>
+        <w:t xml:space="preserve"> (</w:t>
+      </w:r>
+      <w:r>
+        <w:br/>
+      </w:r>
+      <w:r>
+        <w:rPr>
+          <w:rStyle w:val="NormalTok"/>
+        </w:rPr>
+        <w:t xml:space="preserve">    </w:t>
+      </w:r>
+      <w:r>
+        <w:rPr>
+          <w:rStyle w:val="KeywordTok"/>
+        </w:rPr>
+        <w:t xml:space="preserve">SELECT</w:t>
+      </w:r>
+      <w:r>
+        <w:br/>
+      </w:r>
+      <w:r>
+        <w:rPr>
+          <w:rStyle w:val="NormalTok"/>
+        </w:rPr>
+        <w:t xml:space="preserve">        a.admission_id,</w:t>
+      </w:r>
+      <w:r>
+        <w:br/>
+      </w:r>
+      <w:r>
+        <w:rPr>
+          <w:rStyle w:val="NormalTok"/>
+        </w:rPr>
+        <w:t xml:space="preserve">        a.patient_id,</w:t>
+      </w:r>
+      <w:r>
+        <w:br/>
+      </w:r>
+      <w:r>
+        <w:rPr>
+          <w:rStyle w:val="NormalTok"/>
+        </w:rPr>
+        <w:t xml:space="preserve">        a.discharge_date,</w:t>
+      </w:r>
+      <w:r>
+        <w:br/>
+      </w:r>
+      <w:r>
+        <w:rPr>
+          <w:rStyle w:val="NormalTok"/>
+        </w:rPr>
+        <w:t xml:space="preserve">        a.discharge_disposition</w:t>
+      </w:r>
+      <w:r>
+        <w:br/>
+      </w:r>
+      <w:r>
+        <w:rPr>
+          <w:rStyle w:val="NormalTok"/>
+        </w:rPr>
+        <w:t xml:space="preserve">    </w:t>
+      </w:r>
+      <w:r>
+        <w:rPr>
+          <w:rStyle w:val="KeywordTok"/>
+        </w:rPr>
+        <w:t xml:space="preserve">FROM</w:t>
+      </w:r>
+      <w:r>
+        <w:rPr>
+          <w:rStyle w:val="NormalTok"/>
+        </w:rPr>
+        <w:t xml:space="preserve"> admissions a</w:t>
+      </w:r>
+      <w:r>
+        <w:br/>
+      </w:r>
+      <w:r>
+        <w:rPr>
+          <w:rStyle w:val="NormalTok"/>
+        </w:rPr>
+        <w:t xml:space="preserve">    </w:t>
+      </w:r>
+      <w:r>
+        <w:rPr>
+          <w:rStyle w:val="KeywordTok"/>
+        </w:rPr>
+        <w:t xml:space="preserve">JOIN</w:t>
+      </w:r>
+      <w:r>
+        <w:rPr>
+          <w:rStyle w:val="NormalTok"/>
+        </w:rPr>
+        <w:t xml:space="preserve"> diagnoses d </w:t>
+      </w:r>
+      <w:r>
+        <w:rPr>
+          <w:rStyle w:val="KeywordTok"/>
+        </w:rPr>
+        <w:t xml:space="preserve">ON</w:t>
+      </w:r>
+      <w:r>
+        <w:rPr>
+          <w:rStyle w:val="NormalTok"/>
+        </w:rPr>
+        <w:t xml:space="preserve"> a.admission_id </w:t>
+      </w:r>
+      <w:r>
+        <w:rPr>
+          <w:rStyle w:val="OperatorTok"/>
+        </w:rPr>
+        <w:t xml:space="preserve">=</w:t>
+      </w:r>
+      <w:r>
+        <w:rPr>
+          <w:rStyle w:val="NormalTok"/>
+        </w:rPr>
+        <w:t xml:space="preserve"> d.admission_id</w:t>
+      </w:r>
+      <w:r>
+        <w:br/>
+      </w:r>
+      <w:r>
+        <w:rPr>
+          <w:rStyle w:val="NormalTok"/>
+        </w:rPr>
+        <w:t xml:space="preserve">    </w:t>
+      </w:r>
+      <w:r>
+        <w:rPr>
+          <w:rStyle w:val="KeywordTok"/>
+        </w:rPr>
+        <w:t xml:space="preserve">WHERE</w:t>
+      </w:r>
+      <w:r>
+        <w:rPr>
+          <w:rStyle w:val="NormalTok"/>
+        </w:rPr>
+        <w:t xml:space="preserve"> d.icd10_code </w:t>
+      </w:r>
+      <w:r>
+        <w:rPr>
+          <w:rStyle w:val="KeywordTok"/>
+        </w:rPr>
+        <w:t xml:space="preserve">LIKE</w:t>
+      </w:r>
+      <w:r>
+        <w:rPr>
+          <w:rStyle w:val="NormalTok"/>
+        </w:rPr>
+        <w:t xml:space="preserve"> </w:t>
+      </w:r>
+      <w:r>
+        <w:rPr>
+          <w:rStyle w:val="StringTok"/>
+        </w:rPr>
+        <w:t xml:space="preserve">'I50%'</w:t>
+      </w:r>
+      <w:r>
+        <w:br/>
+      </w:r>
+      <w:r>
+        <w:rPr>
+          <w:rStyle w:val="NormalTok"/>
+        </w:rPr>
+        <w:t xml:space="preserve">      </w:t>
+      </w:r>
+      <w:r>
+        <w:rPr>
+          <w:rStyle w:val="KeywordTok"/>
+        </w:rPr>
+        <w:t xml:space="preserve">AND</w:t>
+      </w:r>
+      <w:r>
+        <w:rPr>
+          <w:rStyle w:val="NormalTok"/>
+        </w:rPr>
+        <w:t xml:space="preserve"> a.discharge_date </w:t>
+      </w:r>
+      <w:r>
+        <w:rPr>
+          <w:rStyle w:val="KeywordTok"/>
+        </w:rPr>
+        <w:t xml:space="preserve">BETWEEN</w:t>
+      </w:r>
+      <w:r>
+        <w:rPr>
+          <w:rStyle w:val="NormalTok"/>
+        </w:rPr>
+        <w:t xml:space="preserve"> </w:t>
+      </w:r>
+      <w:r>
+        <w:rPr>
+          <w:rStyle w:val="StringTok"/>
+        </w:rPr>
+        <w:t xml:space="preserve">'2024-01-01'</w:t>
+      </w:r>
+      <w:r>
+        <w:rPr>
+          <w:rStyle w:val="NormalTok"/>
+        </w:rPr>
+        <w:t xml:space="preserve"> </w:t>
+      </w:r>
+      <w:r>
+        <w:rPr>
+          <w:rStyle w:val="KeywordTok"/>
+        </w:rPr>
+        <w:t xml:space="preserve">AND</w:t>
+      </w:r>
+      <w:r>
+        <w:rPr>
+          <w:rStyle w:val="NormalTok"/>
+        </w:rPr>
+        <w:t xml:space="preserve"> </w:t>
+      </w:r>
+      <w:r>
+        <w:rPr>
+          <w:rStyle w:val="StringTok"/>
+        </w:rPr>
+        <w:t xml:space="preserve">'2024-12-31'</w:t>
+      </w:r>
+      <w:r>
+        <w:br/>
+      </w:r>
+      <w:r>
+        <w:rPr>
+          <w:rStyle w:val="NormalTok"/>
+        </w:rPr>
+        <w:t xml:space="preserve">      </w:t>
+      </w:r>
+      <w:r>
+        <w:rPr>
+          <w:rStyle w:val="KeywordTok"/>
+        </w:rPr>
+        <w:t xml:space="preserve">AND</w:t>
+      </w:r>
+      <w:r>
+        <w:rPr>
+          <w:rStyle w:val="NormalTok"/>
+        </w:rPr>
+        <w:t xml:space="preserve"> a.discharge_disposition </w:t>
+      </w:r>
+      <w:r>
+        <w:rPr>
+          <w:rStyle w:val="OperatorTok"/>
+        </w:rPr>
+        <w:t xml:space="preserve">!=</w:t>
+      </w:r>
+      <w:r>
+        <w:rPr>
+          <w:rStyle w:val="NormalTok"/>
+        </w:rPr>
+        <w:t xml:space="preserve"> </w:t>
+      </w:r>
+      <w:r>
+        <w:rPr>
+          <w:rStyle w:val="StringTok"/>
+        </w:rPr>
+        <w:t xml:space="preserve">'HOSPICE'</w:t>
+      </w:r>
+      <w:r>
+        <w:br/>
+      </w:r>
+      <w:r>
+        <w:rPr>
+          <w:rStyle w:val="NormalTok"/>
+        </w:rPr>
+        <w:t xml:space="preserve">),</w:t>
+      </w:r>
+      <w:r>
+        <w:br/>
+      </w:r>
+      <w:r>
+        <w:rPr>
+          <w:rStyle w:val="NormalTok"/>
+        </w:rPr>
+        <w:t xml:space="preserve">Readmissions </w:t>
+      </w:r>
+      <w:r>
+        <w:rPr>
+          <w:rStyle w:val="KeywordTok"/>
+        </w:rPr>
+        <w:t xml:space="preserve">AS</w:t>
+      </w:r>
+      <w:r>
+        <w:rPr>
+          <w:rStyle w:val="NormalTok"/>
+        </w:rPr>
+        <w:t xml:space="preserve"> (</w:t>
+      </w:r>
+      <w:r>
+        <w:br/>
+      </w:r>
+      <w:r>
+        <w:rPr>
+          <w:rStyle w:val="NormalTok"/>
+        </w:rPr>
+        <w:t xml:space="preserve">    </w:t>
+      </w:r>
+      <w:r>
+        <w:rPr>
+          <w:rStyle w:val="KeywordTok"/>
+        </w:rPr>
+        <w:t xml:space="preserve">SELECT</w:t>
+      </w:r>
+      <w:r>
+        <w:br/>
+      </w:r>
+      <w:r>
+        <w:rPr>
+          <w:rStyle w:val="NormalTok"/>
+        </w:rPr>
+        <w:t xml:space="preserve">        i.patient_id,</w:t>
+      </w:r>
+      <w:r>
+        <w:br/>
+      </w:r>
+      <w:r>
+        <w:rPr>
+          <w:rStyle w:val="NormalTok"/>
+        </w:rPr>
+        <w:t xml:space="preserve">        i.admission_id </w:t>
+      </w:r>
+      <w:r>
+        <w:rPr>
+          <w:rStyle w:val="KeywordTok"/>
+        </w:rPr>
+        <w:t xml:space="preserve">AS</w:t>
+      </w:r>
+      <w:r>
+        <w:rPr>
+          <w:rStyle w:val="NormalTok"/>
+        </w:rPr>
+        <w:t xml:space="preserve"> index_admission_id,</w:t>
+      </w:r>
+      <w:r>
+        <w:br/>
+      </w:r>
+      <w:r>
+        <w:rPr>
+          <w:rStyle w:val="NormalTok"/>
+        </w:rPr>
+        <w:t xml:space="preserve">        r.admission_date </w:t>
+      </w:r>
+      <w:r>
+        <w:rPr>
+          <w:rStyle w:val="KeywordTok"/>
+        </w:rPr>
+        <w:t xml:space="preserve">AS</w:t>
+      </w:r>
+      <w:r>
+        <w:rPr>
+          <w:rStyle w:val="NormalTok"/>
+        </w:rPr>
+        <w:t xml:space="preserve"> readmission_date,</w:t>
+      </w:r>
+      <w:r>
+        <w:br/>
+      </w:r>
+      <w:r>
+        <w:rPr>
+          <w:rStyle w:val="NormalTok"/>
+        </w:rPr>
+        <w:t xml:space="preserve">        DATEDIFF(r.admission_date, i.discharge_date) </w:t>
+      </w:r>
+      <w:r>
+        <w:rPr>
+          <w:rStyle w:val="KeywordTok"/>
+        </w:rPr>
+        <w:t xml:space="preserve">AS</w:t>
+      </w:r>
+      <w:r>
+        <w:rPr>
+          <w:rStyle w:val="NormalTok"/>
+        </w:rPr>
+        <w:t xml:space="preserve"> days_to_readmit</w:t>
+      </w:r>
+      <w:r>
+        <w:br/>
+      </w:r>
+      <w:r>
+        <w:rPr>
+          <w:rStyle w:val="NormalTok"/>
+        </w:rPr>
+        <w:t xml:space="preserve">    </w:t>
+      </w:r>
+      <w:r>
+        <w:rPr>
+          <w:rStyle w:val="KeywordTok"/>
+        </w:rPr>
+        <w:t xml:space="preserve">FROM</w:t>
+      </w:r>
+      <w:r>
+        <w:rPr>
+          <w:rStyle w:val="NormalTok"/>
+        </w:rPr>
+        <w:t xml:space="preserve"> IndexAdmissions i</w:t>
+      </w:r>
+      <w:r>
+        <w:br/>
+      </w:r>
+      <w:r>
+        <w:rPr>
+          <w:rStyle w:val="NormalTok"/>
+        </w:rPr>
+        <w:t xml:space="preserve">    </w:t>
+      </w:r>
+      <w:r>
+        <w:rPr>
+          <w:rStyle w:val="KeywordTok"/>
+        </w:rPr>
+        <w:t xml:space="preserve">JOIN</w:t>
+      </w:r>
+      <w:r>
+        <w:rPr>
+          <w:rStyle w:val="NormalTok"/>
+        </w:rPr>
+        <w:t xml:space="preserve"> admissions r </w:t>
+      </w:r>
+      <w:r>
+        <w:rPr>
+          <w:rStyle w:val="KeywordTok"/>
+        </w:rPr>
+        <w:t xml:space="preserve">ON</w:t>
+      </w:r>
+      <w:r>
+        <w:rPr>
+          <w:rStyle w:val="NormalTok"/>
+        </w:rPr>
+        <w:t xml:space="preserve"> i.patient_id </w:t>
+      </w:r>
+      <w:r>
+        <w:rPr>
+          <w:rStyle w:val="OperatorTok"/>
+        </w:rPr>
+        <w:t xml:space="preserve">=</w:t>
+      </w:r>
+      <w:r>
+        <w:rPr>
+          <w:rStyle w:val="NormalTok"/>
+        </w:rPr>
+        <w:t xml:space="preserve"> r.patient_id</w:t>
+      </w:r>
+      <w:r>
+        <w:br/>
+      </w:r>
+      <w:r>
+        <w:rPr>
+          <w:rStyle w:val="NormalTok"/>
+        </w:rPr>
+        <w:t xml:space="preserve">    </w:t>
+      </w:r>
+      <w:r>
+        <w:rPr>
+          <w:rStyle w:val="KeywordTok"/>
+        </w:rPr>
+        <w:t xml:space="preserve">WHERE</w:t>
+      </w:r>
+      <w:r>
+        <w:rPr>
+          <w:rStyle w:val="NormalTok"/>
+        </w:rPr>
+        <w:t xml:space="preserve"> r.admission_date </w:t>
+      </w:r>
+      <w:r>
+        <w:rPr>
+          <w:rStyle w:val="OperatorTok"/>
+        </w:rPr>
+        <w:t xml:space="preserve">&gt;</w:t>
+      </w:r>
+      <w:r>
+        <w:rPr>
+          <w:rStyle w:val="NormalTok"/>
+        </w:rPr>
+        <w:t xml:space="preserve"> i.discharge_date</w:t>
+      </w:r>
+      <w:r>
+        <w:br/>
+      </w:r>
+      <w:r>
+        <w:rPr>
+          <w:rStyle w:val="NormalTok"/>
+        </w:rPr>
+        <w:t xml:space="preserve">      </w:t>
+      </w:r>
+      <w:r>
+        <w:rPr>
+          <w:rStyle w:val="KeywordTok"/>
+        </w:rPr>
+        <w:t xml:space="preserve">AND</w:t>
+      </w:r>
+      <w:r>
+        <w:rPr>
+          <w:rStyle w:val="NormalTok"/>
+        </w:rPr>
+        <w:t xml:space="preserve"> r.admission_date </w:t>
+      </w:r>
+      <w:r>
+        <w:rPr>
+          <w:rStyle w:val="OperatorTok"/>
+        </w:rPr>
+        <w:t xml:space="preserve">&lt;=</w:t>
+      </w:r>
+      <w:r>
+        <w:rPr>
+          <w:rStyle w:val="NormalTok"/>
+        </w:rPr>
+        <w:t xml:space="preserve"> DATE_ADD(i.discharge_date, </w:t>
+      </w:r>
+      <w:r>
+        <w:rPr>
+          <w:rStyle w:val="DataTypeTok"/>
+        </w:rPr>
+        <w:t xml:space="preserve">INTERVAL</w:t>
+      </w:r>
+      <w:r>
+        <w:rPr>
+          <w:rStyle w:val="NormalTok"/>
+        </w:rPr>
+        <w:t xml:space="preserve"> </w:t>
+      </w:r>
+      <w:r>
+        <w:rPr>
+          <w:rStyle w:val="DecValTok"/>
+        </w:rPr>
+        <w:t xml:space="preserve">30</w:t>
+      </w:r>
+      <w:r>
+        <w:rPr>
+          <w:rStyle w:val="NormalTok"/>
+        </w:rPr>
+        <w:t xml:space="preserve"> </w:t>
+      </w:r>
+      <w:r>
+        <w:rPr>
+          <w:rStyle w:val="DataTypeTok"/>
+        </w:rPr>
+        <w:t xml:space="preserve">DAY</w:t>
+      </w:r>
+      <w:r>
+        <w:rPr>
+          <w:rStyle w:val="NormalTok"/>
+        </w:rPr>
+        <w:t xml:space="preserve">)</w:t>
+      </w:r>
+      <w:r>
+        <w:br/>
+      </w:r>
+      <w:r>
+        <w:rPr>
+          <w:rStyle w:val="NormalTok"/>
+        </w:rPr>
+        <w:t xml:space="preserve">)</w:t>
+      </w:r>
+      <w:r>
+        <w:br/>
+      </w:r>
+      <w:r>
+        <w:rPr>
+          <w:rStyle w:val="KeywordTok"/>
+        </w:rPr>
+        <w:t xml:space="preserve">SELECT</w:t>
+      </w:r>
+      <w:r>
+        <w:br/>
+      </w:r>
+      <w:r>
+        <w:rPr>
+          <w:rStyle w:val="NormalTok"/>
+        </w:rPr>
+        <w:t xml:space="preserve">    r.patient_id,</w:t>
+      </w:r>
+      <w:r>
+        <w:br/>
+      </w:r>
+      <w:r>
+        <w:rPr>
+          <w:rStyle w:val="NormalTok"/>
+        </w:rPr>
+        <w:t xml:space="preserve">    r.index_admission_id,</w:t>
+      </w:r>
+      <w:r>
+        <w:br/>
+      </w:r>
+      <w:r>
+        <w:rPr>
+          <w:rStyle w:val="NormalTok"/>
+        </w:rPr>
+        <w:t xml:space="preserve">    r.days_to_readmit,</w:t>
+      </w:r>
+      <w:r>
+        <w:br/>
+      </w:r>
+      <w:r>
+        <w:rPr>
+          <w:rStyle w:val="NormalTok"/>
+        </w:rPr>
+        <w:t xml:space="preserve">    </w:t>
+      </w:r>
+      <w:r>
+        <w:rPr>
+          <w:rStyle w:val="FunctionTok"/>
+        </w:rPr>
+        <w:t xml:space="preserve">MAX</w:t>
+      </w:r>
+      <w:r>
+        <w:rPr>
+          <w:rStyle w:val="NormalTok"/>
+        </w:rPr>
+        <w:t xml:space="preserve">(</w:t>
+      </w:r>
+      <w:r>
+        <w:rPr>
+          <w:rStyle w:val="ControlFlowTok"/>
+        </w:rPr>
+        <w:t xml:space="preserve">CASE</w:t>
+      </w:r>
+      <w:r>
+        <w:br/>
+      </w:r>
+      <w:r>
+        <w:rPr>
+          <w:rStyle w:val="NormalTok"/>
+        </w:rPr>
+        <w:t xml:space="preserve">        </w:t>
+      </w:r>
+      <w:r>
+        <w:rPr>
+          <w:rStyle w:val="ControlFlowTok"/>
+        </w:rPr>
+        <w:t xml:space="preserve">WHEN</w:t>
+      </w:r>
+      <w:r>
+        <w:rPr>
+          <w:rStyle w:val="NormalTok"/>
+        </w:rPr>
+        <w:t xml:space="preserve"> l.unit </w:t>
+      </w:r>
+      <w:r>
+        <w:rPr>
+          <w:rStyle w:val="OperatorTok"/>
+        </w:rPr>
+        <w:t xml:space="preserve">=</w:t>
+      </w:r>
+      <w:r>
+        <w:rPr>
+          <w:rStyle w:val="NormalTok"/>
+        </w:rPr>
+        <w:t xml:space="preserve"> </w:t>
+      </w:r>
+      <w:r>
+        <w:rPr>
+          <w:rStyle w:val="StringTok"/>
+        </w:rPr>
+        <w:t xml:space="preserve">'mg/dL'</w:t>
+      </w:r>
+      <w:r>
+        <w:rPr>
+          <w:rStyle w:val="NormalTok"/>
+        </w:rPr>
+        <w:t xml:space="preserve"> </w:t>
+      </w:r>
+      <w:r>
+        <w:rPr>
+          <w:rStyle w:val="ControlFlowTok"/>
+        </w:rPr>
+        <w:t xml:space="preserve">THEN</w:t>
+      </w:r>
+      <w:r>
+        <w:rPr>
+          <w:rStyle w:val="NormalTok"/>
+        </w:rPr>
+        <w:t xml:space="preserve"> l.val_num</w:t>
+      </w:r>
+      <w:r>
+        <w:br/>
+      </w:r>
+      <w:r>
+        <w:rPr>
+          <w:rStyle w:val="NormalTok"/>
+        </w:rPr>
+        <w:t xml:space="preserve">        </w:t>
+      </w:r>
+      <w:r>
+        <w:rPr>
+          <w:rStyle w:val="ControlFlowTok"/>
+        </w:rPr>
+        <w:t xml:space="preserve">WHEN</w:t>
+      </w:r>
+      <w:r>
+        <w:rPr>
+          <w:rStyle w:val="NormalTok"/>
+        </w:rPr>
+        <w:t xml:space="preserve"> l.unit </w:t>
+      </w:r>
+      <w:r>
+        <w:rPr>
+          <w:rStyle w:val="OperatorTok"/>
+        </w:rPr>
+        <w:t xml:space="preserve">=</w:t>
+      </w:r>
+      <w:r>
+        <w:rPr>
+          <w:rStyle w:val="NormalTok"/>
+        </w:rPr>
+        <w:t xml:space="preserve"> </w:t>
+      </w:r>
+      <w:r>
+        <w:rPr>
+          <w:rStyle w:val="StringTok"/>
+        </w:rPr>
+        <w:t xml:space="preserve">'mmol/L'</w:t>
+      </w:r>
+      <w:r>
+        <w:rPr>
+          <w:rStyle w:val="NormalTok"/>
+        </w:rPr>
+        <w:t xml:space="preserve"> </w:t>
+      </w:r>
+      <w:r>
+        <w:rPr>
+          <w:rStyle w:val="ControlFlowTok"/>
+        </w:rPr>
+        <w:t xml:space="preserve">THEN</w:t>
+      </w:r>
+      <w:r>
+        <w:rPr>
+          <w:rStyle w:val="NormalTok"/>
+        </w:rPr>
+        <w:t xml:space="preserve"> l.val_num </w:t>
+      </w:r>
+      <w:r>
+        <w:rPr>
+          <w:rStyle w:val="OperatorTok"/>
+        </w:rPr>
+        <w:t xml:space="preserve">/</w:t>
+      </w:r>
+      <w:r>
+        <w:rPr>
+          <w:rStyle w:val="NormalTok"/>
+        </w:rPr>
+        <w:t xml:space="preserve"> </w:t>
+      </w:r>
+      <w:r>
+        <w:rPr>
+          <w:rStyle w:val="FloatTok"/>
+        </w:rPr>
+        <w:t xml:space="preserve">88.4</w:t>
+      </w:r>
+      <w:r>
+        <w:br/>
+      </w:r>
+      <w:r>
+        <w:rPr>
+          <w:rStyle w:val="NormalTok"/>
+        </w:rPr>
+        <w:t xml:space="preserve">        </w:t>
+      </w:r>
+      <w:r>
+        <w:rPr>
+          <w:rStyle w:val="ControlFlowTok"/>
+        </w:rPr>
+        <w:t xml:space="preserve">ELSE</w:t>
+      </w:r>
+      <w:r>
+        <w:rPr>
+          <w:rStyle w:val="NormalTok"/>
+        </w:rPr>
+        <w:t xml:space="preserve"> </w:t>
+      </w:r>
+      <w:r>
+        <w:rPr>
+          <w:rStyle w:val="KeywordTok"/>
+        </w:rPr>
+        <w:t xml:space="preserve">NULL</w:t>
+      </w:r>
+      <w:r>
+        <w:br/>
+      </w:r>
+      <w:r>
+        <w:rPr>
+          <w:rStyle w:val="NormalTok"/>
+        </w:rPr>
+        <w:t xml:space="preserve">    </w:t>
+      </w:r>
+      <w:r>
+        <w:rPr>
+          <w:rStyle w:val="ControlFlowTok"/>
+        </w:rPr>
+        <w:t xml:space="preserve">END</w:t>
+      </w:r>
+      <w:r>
+        <w:rPr>
+          <w:rStyle w:val="NormalTok"/>
+        </w:rPr>
+        <w:t xml:space="preserve">) </w:t>
+      </w:r>
+      <w:r>
+        <w:rPr>
+          <w:rStyle w:val="KeywordTok"/>
+        </w:rPr>
+        <w:t xml:space="preserve">as</w:t>
+      </w:r>
+      <w:r>
+        <w:rPr>
+          <w:rStyle w:val="NormalTok"/>
+        </w:rPr>
+        <w:t xml:space="preserve"> max_creatinine_mgdl</w:t>
+      </w:r>
+      <w:r>
+        <w:br/>
+      </w:r>
+      <w:r>
+        <w:rPr>
+          <w:rStyle w:val="KeywordTok"/>
+        </w:rPr>
+        <w:t xml:space="preserve">FROM</w:t>
+      </w:r>
+      <w:r>
+        <w:rPr>
+          <w:rStyle w:val="NormalTok"/>
+        </w:rPr>
+        <w:t xml:space="preserve"> Readmissions r</w:t>
+      </w:r>
+      <w:r>
+        <w:br/>
+      </w:r>
+      <w:r>
+        <w:rPr>
+          <w:rStyle w:val="KeywordTok"/>
+        </w:rPr>
+        <w:t xml:space="preserve">JOIN</w:t>
+      </w:r>
+      <w:r>
+        <w:rPr>
+          <w:rStyle w:val="NormalTok"/>
+        </w:rPr>
+        <w:t xml:space="preserve"> lab_events l </w:t>
+      </w:r>
+      <w:r>
+        <w:rPr>
+          <w:rStyle w:val="KeywordTok"/>
+        </w:rPr>
+        <w:t xml:space="preserve">ON</w:t>
+      </w:r>
+      <w:r>
+        <w:rPr>
+          <w:rStyle w:val="NormalTok"/>
+        </w:rPr>
+        <w:t xml:space="preserve"> r.index_admission_id </w:t>
+      </w:r>
+      <w:r>
+        <w:rPr>
+          <w:rStyle w:val="OperatorTok"/>
+        </w:rPr>
+        <w:t xml:space="preserve">=</w:t>
+      </w:r>
+      <w:r>
+        <w:rPr>
+          <w:rStyle w:val="NormalTok"/>
+        </w:rPr>
+        <w:t xml:space="preserve"> l.admission_id</w:t>
+      </w:r>
+      <w:r>
+        <w:br/>
+      </w:r>
+      <w:r>
+        <w:rPr>
+          <w:rStyle w:val="KeywordTok"/>
+        </w:rPr>
+        <w:t xml:space="preserve">WHERE</w:t>
+      </w:r>
+      <w:r>
+        <w:rPr>
+          <w:rStyle w:val="NormalTok"/>
+        </w:rPr>
+        <w:t xml:space="preserve"> l.itemid </w:t>
+      </w:r>
+      <w:r>
+        <w:rPr>
+          <w:rStyle w:val="KeywordTok"/>
+        </w:rPr>
+        <w:t xml:space="preserve">IN</w:t>
+      </w:r>
+      <w:r>
+        <w:rPr>
+          <w:rStyle w:val="NormalTok"/>
+        </w:rPr>
+        <w:t xml:space="preserve"> (</w:t>
+      </w:r>
+      <w:r>
+        <w:rPr>
+          <w:rStyle w:val="DecValTok"/>
+        </w:rPr>
+        <w:t xml:space="preserve">50912</w:t>
+      </w:r>
+      <w:r>
+        <w:rPr>
+          <w:rStyle w:val="NormalTok"/>
+        </w:rPr>
+        <w:t xml:space="preserve">, </w:t>
+      </w:r>
+      <w:r>
+        <w:rPr>
+          <w:rStyle w:val="DecValTok"/>
+        </w:rPr>
+        <w:t xml:space="preserve">50913</w:t>
+      </w:r>
+      <w:r>
+        <w:rPr>
+          <w:rStyle w:val="NormalTok"/>
+        </w:rPr>
+        <w:t xml:space="preserve">)</w:t>
+      </w:r>
+      <w:r>
+        <w:br/>
+      </w:r>
+      <w:r>
+        <w:rPr>
+          <w:rStyle w:val="KeywordTok"/>
+        </w:rPr>
+        <w:t xml:space="preserve">GROUP</w:t>
+      </w:r>
+      <w:r>
+        <w:rPr>
+          <w:rStyle w:val="NormalTok"/>
+        </w:rPr>
+        <w:t xml:space="preserve"> </w:t>
+      </w:r>
+      <w:r>
+        <w:rPr>
+          <w:rStyle w:val="KeywordTok"/>
+        </w:rPr>
+        <w:t xml:space="preserve">BY</w:t>
+      </w:r>
+      <w:r>
+        <w:rPr>
+          <w:rStyle w:val="NormalTok"/>
+        </w:rPr>
+        <w:t xml:space="preserve"> r.patient_id, r.index_admission_id, r.days_to_readmit;</w:t>
+      </w:r>
+    </w:p>
+    <w:p>
+      <w:pPr>
+        <w:pStyle w:val="FirstParagraph"/>
+      </w:pPr>
+      <w:r>
+        <w:rPr>
+          <w:b/>
+          <w:bCs/>
+        </w:rPr>
+        <w:t xml:space="preserve">Rationale Metadata:</w:t>
+      </w:r>
+      <w:r>
+        <w:t xml:space="preserve"> </w:t>
+      </w:r>
+      <w:r>
+        <w:t xml:space="preserve">Supports CMS Hospital Readmissions Reduction Program (HRRP) tracking. Hospice exclusion per CMS 2025 rules (discharge disposition !=</w:t>
+      </w:r>
+      <w:r>
+        <w:t xml:space="preserve"> </w:t>
+      </w:r>
+      <w:r>
+        <w:t xml:space="preserve">‘HOSPICE’</w:t>
+      </w:r>
+      <w:r>
+        <w:t xml:space="preserve">). Creatinine unit normalization (mmol/L to mg/dL via /88.4) required because our lab system stores results in mixed units depending on the originating facility. Lab item IDs 50912 and 50913 are MIMIC-III creatinine codes; local implementations must map to their own lab dictionary.</w:t>
+      </w:r>
+    </w:p>
+    <w:p>
+      <w:r>
+        <w:pict>
+          <v:rect style="width:0;height:1.5pt" o:hralign="center" o:hrstd="t" o:hr="t"/>
+        </w:pict>
+      </w:r>
+    </w:p>
+    <w:bookmarkEnd w:id="10"/>
+    <w:bookmarkStart w:id="11" w:name="triple-3-quality-metric-aggregation"/>
+    <w:p>
+      <w:pPr>
+        <w:pStyle w:val="Heading3"/>
+      </w:pPr>
+      <w:r>
+        <w:t xml:space="preserve">Triple 3: Quality Metric Aggregation</w:t>
+      </w:r>
+    </w:p>
+    <w:p>
+      <w:pPr>
+        <w:pStyle w:val="FirstParagraph"/>
+      </w:pPr>
+      <w:r>
+        <w:rPr>
+          <w:b/>
+          <w:bCs/>
+        </w:rPr>
+        <w:t xml:space="preserve">Natural Language Intent:</w:t>
+      </w:r>
+      <w:r>
+        <w:t xml:space="preserve"> </w:t>
+      </w:r>
+      <w:r>
+        <w:t xml:space="preserve">“How many patients were readmitted within 30 days of discharge for heart failure?”</w:t>
+      </w:r>
+    </w:p>
+    <w:p>
+      <w:pPr>
+        <w:pStyle w:val="BodyText"/>
+      </w:pPr>
+      <w:r>
+        <w:rPr>
+          <w:b/>
+          <w:bCs/>
+        </w:rPr>
+        <w:t xml:space="preserve">Executable SQL:</w:t>
+      </w:r>
+    </w:p>
+    <w:p>
+      <w:pPr>
+        <w:pStyle w:val="SourceCode"/>
+      </w:pPr>
+      <w:r>
+        <w:rPr>
+          <w:rStyle w:val="KeywordTok"/>
+        </w:rPr>
+        <w:t xml:space="preserve">SELECT</w:t>
+      </w:r>
+      <w:r>
+        <w:rPr>
+          <w:rStyle w:val="NormalTok"/>
+        </w:rPr>
+        <w:t xml:space="preserve"> </w:t>
+      </w:r>
+      <w:r>
+        <w:rPr>
+          <w:rStyle w:val="FunctionTok"/>
+        </w:rPr>
+        <w:t xml:space="preserve">COUNT</w:t>
+      </w:r>
+      <w:r>
+        <w:rPr>
+          <w:rStyle w:val="NormalTok"/>
+        </w:rPr>
+        <w:t xml:space="preserve">(</w:t>
+      </w:r>
+      <w:r>
+        <w:rPr>
+          <w:rStyle w:val="KeywordTok"/>
+        </w:rPr>
+        <w:t xml:space="preserve">DISTINCT</w:t>
+      </w:r>
+      <w:r>
+        <w:rPr>
+          <w:rStyle w:val="NormalTok"/>
+        </w:rPr>
+        <w:t xml:space="preserve"> r.patient_id) </w:t>
+      </w:r>
+      <w:r>
+        <w:rPr>
+          <w:rStyle w:val="KeywordTok"/>
+        </w:rPr>
+        <w:t xml:space="preserve">as</w:t>
+      </w:r>
+      <w:r>
+        <w:rPr>
+          <w:rStyle w:val="NormalTok"/>
+        </w:rPr>
+        <w:t xml:space="preserve"> readmission_count</w:t>
+      </w:r>
+      <w:r>
+        <w:br/>
+      </w:r>
+      <w:r>
+        <w:rPr>
+          <w:rStyle w:val="KeywordTok"/>
+        </w:rPr>
+        <w:t xml:space="preserve">FROM</w:t>
+      </w:r>
+      <w:r>
+        <w:rPr>
+          <w:rStyle w:val="NormalTok"/>
+        </w:rPr>
+        <w:t xml:space="preserve"> (</w:t>
+      </w:r>
+      <w:r>
+        <w:br/>
+      </w:r>
+      <w:r>
+        <w:rPr>
+          <w:rStyle w:val="NormalTok"/>
+        </w:rPr>
+        <w:t xml:space="preserve">  </w:t>
+      </w:r>
+      <w:r>
+        <w:rPr>
+          <w:rStyle w:val="KeywordTok"/>
+        </w:rPr>
+        <w:t xml:space="preserve">SELECT</w:t>
+      </w:r>
+      <w:r>
+        <w:rPr>
+          <w:rStyle w:val="NormalTok"/>
+        </w:rPr>
+        <w:t xml:space="preserve"> a1.patient_id, a1.discharge_date, a2.admission_date</w:t>
+      </w:r>
+      <w:r>
+        <w:br/>
+      </w:r>
+      <w:r>
+        <w:rPr>
+          <w:rStyle w:val="NormalTok"/>
+        </w:rPr>
+        <w:t xml:space="preserve">  </w:t>
+      </w:r>
+      <w:r>
+        <w:rPr>
+          <w:rStyle w:val="KeywordTok"/>
+        </w:rPr>
+        <w:t xml:space="preserve">FROM</w:t>
+      </w:r>
+      <w:r>
+        <w:rPr>
+          <w:rStyle w:val="NormalTok"/>
+        </w:rPr>
+        <w:t xml:space="preserve"> admissions a1</w:t>
+      </w:r>
+      <w:r>
+        <w:br/>
+      </w:r>
+      <w:r>
+        <w:rPr>
+          <w:rStyle w:val="NormalTok"/>
+        </w:rPr>
+        <w:t xml:space="preserve">  </w:t>
+      </w:r>
+      <w:r>
+        <w:rPr>
+          <w:rStyle w:val="KeywordTok"/>
+        </w:rPr>
+        <w:t xml:space="preserve">JOIN</w:t>
+      </w:r>
+      <w:r>
+        <w:rPr>
+          <w:rStyle w:val="NormalTok"/>
+        </w:rPr>
+        <w:t xml:space="preserve"> admissions a2 </w:t>
+      </w:r>
+      <w:r>
+        <w:rPr>
+          <w:rStyle w:val="KeywordTok"/>
+        </w:rPr>
+        <w:t xml:space="preserve">ON</w:t>
+      </w:r>
+      <w:r>
+        <w:rPr>
+          <w:rStyle w:val="NormalTok"/>
+        </w:rPr>
+        <w:t xml:space="preserve"> a1.patient_id </w:t>
+      </w:r>
+      <w:r>
+        <w:rPr>
+          <w:rStyle w:val="OperatorTok"/>
+        </w:rPr>
+        <w:t xml:space="preserve">=</w:t>
+      </w:r>
+      <w:r>
+        <w:rPr>
+          <w:rStyle w:val="NormalTok"/>
+        </w:rPr>
+        <w:t xml:space="preserve"> a2.patient_id</w:t>
+      </w:r>
+      <w:r>
+        <w:br/>
+      </w:r>
+      <w:r>
+        <w:rPr>
+          <w:rStyle w:val="NormalTok"/>
+        </w:rPr>
+        <w:t xml:space="preserve">  </w:t>
+      </w:r>
+      <w:r>
+        <w:rPr>
+          <w:rStyle w:val="KeywordTok"/>
+        </w:rPr>
+        <w:t xml:space="preserve">JOIN</w:t>
+      </w:r>
+      <w:r>
+        <w:rPr>
+          <w:rStyle w:val="NormalTok"/>
+        </w:rPr>
+        <w:t xml:space="preserve"> diagnoses d </w:t>
+      </w:r>
+      <w:r>
+        <w:rPr>
+          <w:rStyle w:val="KeywordTok"/>
+        </w:rPr>
+        <w:t xml:space="preserve">ON</w:t>
+      </w:r>
+      <w:r>
+        <w:rPr>
+          <w:rStyle w:val="NormalTok"/>
+        </w:rPr>
+        <w:t xml:space="preserve"> a2.admission_id </w:t>
+      </w:r>
+      <w:r>
+        <w:rPr>
+          <w:rStyle w:val="OperatorTok"/>
+        </w:rPr>
+        <w:t xml:space="preserve">=</w:t>
+      </w:r>
+      <w:r>
+        <w:rPr>
+          <w:rStyle w:val="NormalTok"/>
+        </w:rPr>
+        <w:t xml:space="preserve"> d.admission_id</w:t>
+      </w:r>
+      <w:r>
+        <w:br/>
+      </w:r>
+      <w:r>
+        <w:rPr>
+          <w:rStyle w:val="NormalTok"/>
+        </w:rPr>
+        <w:t xml:space="preserve">  </w:t>
+      </w:r>
+      <w:r>
+        <w:rPr>
+          <w:rStyle w:val="KeywordTok"/>
+        </w:rPr>
+        <w:t xml:space="preserve">WHERE</w:t>
+      </w:r>
+      <w:r>
+        <w:rPr>
+          <w:rStyle w:val="NormalTok"/>
+        </w:rPr>
+        <w:t xml:space="preserve"> d.icd10_code </w:t>
+      </w:r>
+      <w:r>
+        <w:rPr>
+          <w:rStyle w:val="KeywordTok"/>
+        </w:rPr>
+        <w:t xml:space="preserve">LIKE</w:t>
+      </w:r>
+      <w:r>
+        <w:rPr>
+          <w:rStyle w:val="NormalTok"/>
+        </w:rPr>
+        <w:t xml:space="preserve"> </w:t>
+      </w:r>
+      <w:r>
+        <w:rPr>
+          <w:rStyle w:val="StringTok"/>
+        </w:rPr>
+        <w:t xml:space="preserve">'I50%'</w:t>
+      </w:r>
+      <w:r>
+        <w:br/>
+      </w:r>
+      <w:r>
+        <w:rPr>
+          <w:rStyle w:val="NormalTok"/>
+        </w:rPr>
+        <w:t xml:space="preserve">    </w:t>
+      </w:r>
+      <w:r>
+        <w:rPr>
+          <w:rStyle w:val="KeywordTok"/>
+        </w:rPr>
+        <w:t xml:space="preserve">AND</w:t>
+      </w:r>
+      <w:r>
+        <w:rPr>
+          <w:rStyle w:val="NormalTok"/>
+        </w:rPr>
+        <w:t xml:space="preserve"> a2.admission_date </w:t>
+      </w:r>
+      <w:r>
+        <w:rPr>
+          <w:rStyle w:val="KeywordTok"/>
+        </w:rPr>
+        <w:t xml:space="preserve">BETWEEN</w:t>
+      </w:r>
+      <w:r>
+        <w:rPr>
+          <w:rStyle w:val="NormalTok"/>
+        </w:rPr>
+        <w:t xml:space="preserve"> a1.discharge_date</w:t>
+      </w:r>
+      <w:r>
+        <w:br/>
+      </w:r>
+      <w:r>
+        <w:rPr>
+          <w:rStyle w:val="NormalTok"/>
+        </w:rPr>
+        <w:t xml:space="preserve">        </w:t>
+      </w:r>
+      <w:r>
+        <w:rPr>
+          <w:rStyle w:val="KeywordTok"/>
+        </w:rPr>
+        <w:t xml:space="preserve">AND</w:t>
+      </w:r>
+      <w:r>
+        <w:rPr>
+          <w:rStyle w:val="NormalTok"/>
+        </w:rPr>
+        <w:t xml:space="preserve"> DATE_ADD(a1.discharge_date, </w:t>
+      </w:r>
+      <w:r>
+        <w:rPr>
+          <w:rStyle w:val="DataTypeTok"/>
+        </w:rPr>
+        <w:t xml:space="preserve">INTERVAL</w:t>
+      </w:r>
+      <w:r>
+        <w:rPr>
+          <w:rStyle w:val="NormalTok"/>
+        </w:rPr>
+        <w:t xml:space="preserve"> </w:t>
+      </w:r>
+      <w:r>
+        <w:rPr>
+          <w:rStyle w:val="DecValTok"/>
+        </w:rPr>
+        <w:t xml:space="preserve">30</w:t>
+      </w:r>
+      <w:r>
+        <w:rPr>
+          <w:rStyle w:val="NormalTok"/>
+        </w:rPr>
+        <w:t xml:space="preserve"> </w:t>
+      </w:r>
+      <w:r>
+        <w:rPr>
+          <w:rStyle w:val="DataTypeTok"/>
+        </w:rPr>
+        <w:t xml:space="preserve">DAY</w:t>
+      </w:r>
+      <w:r>
+        <w:rPr>
+          <w:rStyle w:val="NormalTok"/>
+        </w:rPr>
+        <w:t xml:space="preserve">)</w:t>
+      </w:r>
+      <w:r>
+        <w:br/>
+      </w:r>
+      <w:r>
+        <w:rPr>
+          <w:rStyle w:val="NormalTok"/>
+        </w:rPr>
+        <w:t xml:space="preserve">    </w:t>
+      </w:r>
+      <w:r>
+        <w:rPr>
+          <w:rStyle w:val="KeywordTok"/>
+        </w:rPr>
+        <w:t xml:space="preserve">AND</w:t>
+      </w:r>
+      <w:r>
+        <w:rPr>
+          <w:rStyle w:val="NormalTok"/>
+        </w:rPr>
+        <w:t xml:space="preserve"> a1.admission_id </w:t>
+      </w:r>
+      <w:r>
+        <w:rPr>
+          <w:rStyle w:val="OperatorTok"/>
+        </w:rPr>
+        <w:t xml:space="preserve">!=</w:t>
+      </w:r>
+      <w:r>
+        <w:rPr>
+          <w:rStyle w:val="NormalTok"/>
+        </w:rPr>
+        <w:t xml:space="preserve"> a2.admission_id</w:t>
+      </w:r>
+      <w:r>
+        <w:br/>
+      </w:r>
+      <w:r>
+        <w:rPr>
+          <w:rStyle w:val="NormalTok"/>
+        </w:rPr>
+        <w:t xml:space="preserve">) r</w:t>
+      </w:r>
+    </w:p>
+    <w:p>
+      <w:pPr>
+        <w:pStyle w:val="FirstParagraph"/>
+      </w:pPr>
+      <w:r>
+        <w:rPr>
+          <w:b/>
+          <w:bCs/>
+        </w:rPr>
+        <w:t xml:space="preserve">Rationale Metadata:</w:t>
+      </w:r>
+      <w:r>
+        <w:t xml:space="preserve"> </w:t>
+      </w:r>
+      <w:r>
+        <w:t xml:space="preserve">Aligned with CMS HRRP requirements for organizational quality reporting. COUNT(DISTINCT patient_id) ensures each patient is counted once even if they have multiple readmissions. This is the aggregate metric version of Triple 2; the detailed cohort query should be run first to validate individual cases before reporting the aggregate number.</w:t>
+      </w:r>
+    </w:p>
+    <w:p>
+      <w:r>
+        <w:pict>
+          <v:rect style="width:0;height:1.5pt" o:hralign="center" o:hrstd="t" o:hr="t"/>
+        </w:pict>
+      </w:r>
+    </w:p>
+    <w:bookmarkEnd w:id="11"/>
+    <w:bookmarkEnd w:id="12"/>
+    <w:bookmarkStart w:id="13" w:name="X6244932574d711a11b7889794a7a7a7a3de904b"/>
+    <w:p>
+      <w:pPr>
+        <w:pStyle w:val="Heading2"/>
+      </w:pPr>
+      <w:r>
+        <w:t xml:space="preserve">How Triples Preserve Institutional Knowledge</w:t>
+      </w:r>
+    </w:p>
+    <w:p>
+      <w:pPr>
+        <w:pStyle w:val="FirstParagraph"/>
+      </w:pPr>
+      <w:r>
+        <w:t xml:space="preserve">In traditional analytics workflows, only the SQL (component 2) would be saved, if anything. The Natural Language Intent (component 1) would exist only in an email or chat message. The Rationale Metadata (component 3), the most critical knowledge for institutional continuity, would exist only in the departing analyst’s memory.</w:t>
+      </w:r>
+    </w:p>
+    <w:p>
+      <w:pPr>
+        <w:pStyle w:val="BodyText"/>
+      </w:pPr>
+      <w:r>
+        <w:t xml:space="preserve">When a new analyst inherits these triples, they receive not just executable code but the clinical reasoning, regulatory context, and institutional conventions that informed the query’s construction. This is the mechanism by which HITL-KG converts ephemeral analytical work into durable organizational memory.</w:t>
+      </w:r>
+    </w:p>
+    <w:bookmarkEnd w:id="13"/>
+    <w:bookmarkStart w:id="14" w:name="references"/>
     <w:p>
       <w:pPr>
         <w:pStyle w:val="Heading2"/>
@@ -564,11 +2070,23 @@
         </w:numPr>
       </w:pPr>
       <w:r>
-        <w:t xml:space="preserve">Healthcare Information and Management Systems Society (HIMSS). Analytics maturity assessment model (AMAM) global report. HIMSS Analytics; 2024. Available from: https://www.himss.org/maturity-models/amam/</w:t>
+        <w:t xml:space="preserve">National Committee for Quality Assurance (NCQA). HEDIS measures and technical resources. 2025. Available from: https://www.ncqa.org/hedis/</w:t>
       </w:r>
     </w:p>
-    <w:bookmarkEnd w:id="10"/>
-    <w:bookmarkEnd w:id="11"/>
+    <w:p>
+      <w:pPr>
+        <w:pStyle w:val="Compact"/>
+        <w:numPr>
+          <w:ilvl w:val="0"/>
+          <w:numId w:val="1001"/>
+        </w:numPr>
+      </w:pPr>
+      <w:r>
+        <w:t xml:space="preserve">Centers for Medicare and Medicaid Services (CMS). Hospital Readmissions Reduction Program (HRRP). 2025. Available from: https://www.cms.gov/medicare/payment/prospective-payment-systems/acute-inpatient-pps/hospital-readmissions-reduction-program-hrrp</w:t>
+      </w:r>
+    </w:p>
+    <w:bookmarkEnd w:id="14"/>
+    <w:bookmarkEnd w:id="15"/>
     <w:sectPr>
       <w:footnotePr>
         <w:numRestart w:val="eachSect"/>

</xml_diff>

<commit_message>
build: format DOCX for JMIR submission with proper academic styling
Added custom reference.docx for pandoc with:
- Times New Roman 12pt
- Double line spacing
- 1-inch margins

DOCX now has professional academic formatting suitable for journal
submission. JMIR says formatting is not critical for initial review
but this improves first impression.

Refs #506

Co-Authored-By: Claude Opus 4.6 (1M context) <noreply@anthropic.com>
</commit_message>
<xml_diff>
--- a/multimedia_appendix_1.docx
+++ b/multimedia_appendix_1.docx
@@ -2,56 +2,6 @@
 <file path=word/document.xml><?xml version="1.0" encoding="utf-8"?>
 <w:document xmlns:w="http://schemas.openxmlformats.org/wordprocessingml/2006/main" xmlns:m="http://schemas.openxmlformats.org/officeDocument/2006/math" xmlns:r="http://schemas.openxmlformats.org/officeDocument/2006/relationships" xmlns:o="urn:schemas-microsoft-com:office:office" xmlns:v="urn:schemas-microsoft-com:vml" xmlns:w10="urn:schemas-microsoft-com:office:word" xmlns:a="http://schemas.openxmlformats.org/drawingml/2006/main" xmlns:pic="http://schemas.openxmlformats.org/drawingml/2006/picture" xmlns:wp="http://schemas.openxmlformats.org/drawingml/2006/wordprocessingDrawing">
   <w:body>
-    <w:p>
-      <w:pPr>
-        <w:pStyle w:val="Title"/>
-      </w:pPr>
-      <w:r>
-        <w:t xml:space="preserve">Multimedia Appendix</w:t>
-      </w:r>
-    </w:p>
-    <w:p>
-      <w:pPr>
-        <w:pStyle w:val="Author"/>
-      </w:pPr>
-      <w:r>
-        <w:t xml:space="preserve">Samuel T Harrold, Yuimedi, Inc.</w:t>
-      </w:r>
-    </w:p>
-    <w:p>
-      <w:pPr>
-        <w:pStyle w:val="Date"/>
-      </w:pPr>
-      <w:r>
-        <w:t xml:space="preserve">March 2026</w:t>
-      </w:r>
-    </w:p>
-    <w:sdt>
-      <w:sdtPr>
-        <w:docPartObj>
-          <w:docPartGallery w:val="Table of Contents"/>
-          <w:docPartUnique/>
-        </w:docPartObj>
-      </w:sdtPr>
-      <w:sdtContent>
-        <w:p>
-          <w:pPr>
-            <w:pStyle w:val="TOCHeading"/>
-          </w:pPr>
-          <w:r>
-            <w:t xml:space="preserve">Table of Contents</w:t>
-          </w:r>
-        </w:p>
-        <w:p>
-          <w:r>
-            <w:fldChar w:fldCharType="begin" w:dirty="true"/>
-            <w:instrText xml:space="preserve">TOC \o "1-3" \h \z \u</w:instrText>
-            <w:fldChar w:fldCharType="separate"/>
-            <w:fldChar w:fldCharType="end"/>
-          </w:r>
-        </w:p>
-      </w:sdtContent>
-    </w:sdt>
     <w:bookmarkStart w:id="15" w:name="multimedia-appendix-1"/>
     <w:p>
       <w:pPr>
@@ -2337,8 +2287,16 @@
   </w:docDefaults>
   <w:latentStyles w:count="276" w:defLockedState="0" w:defQFormat="0" w:defSemiHidden="0" w:defUIPriority="0" w:defUnhideWhenUsed="0"/>
   <w:style w:default="1" w:styleId="Normal" w:type="paragraph">
+    <w:pPr>
+      <w:spacing w:after="0" w:line="480" w:lineRule="auto"/>
+    </w:pPr>
     <w:name w:val="Normal"/>
     <w:qFormat/>
+    <w:rPr>
+      <w:rFonts w:ascii="Times New Roman" w:hAnsi="Times New Roman"/>
+      <w:sz w:val="24"/>
+      <w:szCs w:val="24"/>
+    </w:rPr>
   </w:style>
   <w:style w:styleId="BodyText" w:type="paragraph">
     <w:name w:val="Body Text"/>

</xml_diff>

<commit_message>
fix: update build_paper.sh CSL path and remove stale appendix fallback
- CSL_FILE: citation-style.csl (deleted) -> citation-style-ama.csl
- Remove APPENDIX_FILE fallback for non-existent multimedia_appendix.md
- Simplify appendix discovery to just multimedia_appendix_*.md glob
- Rebuild all artifacts

Refs #506

Co-Authored-By: Claude Opus 4.6 (1M context) <noreply@anthropic.com>
</commit_message>
<xml_diff>
--- a/multimedia_appendix_1.docx
+++ b/multimedia_appendix_1.docx
@@ -2,6 +2,56 @@
 <file path=word/document.xml><?xml version="1.0" encoding="utf-8"?>
 <w:document xmlns:w="http://schemas.openxmlformats.org/wordprocessingml/2006/main" xmlns:m="http://schemas.openxmlformats.org/officeDocument/2006/math" xmlns:r="http://schemas.openxmlformats.org/officeDocument/2006/relationships" xmlns:o="urn:schemas-microsoft-com:office:office" xmlns:v="urn:schemas-microsoft-com:vml" xmlns:w10="urn:schemas-microsoft-com:office:word" xmlns:a="http://schemas.openxmlformats.org/drawingml/2006/main" xmlns:pic="http://schemas.openxmlformats.org/drawingml/2006/picture" xmlns:wp="http://schemas.openxmlformats.org/drawingml/2006/wordprocessingDrawing">
   <w:body>
+    <w:p>
+      <w:pPr>
+        <w:pStyle w:val="Title"/>
+      </w:pPr>
+      <w:r>
+        <w:t xml:space="preserve">Multimedia Appendix</w:t>
+      </w:r>
+    </w:p>
+    <w:p>
+      <w:pPr>
+        <w:pStyle w:val="Author"/>
+      </w:pPr>
+      <w:r>
+        <w:t xml:space="preserve">Samuel T Harrold, Yuimedi, Inc.</w:t>
+      </w:r>
+    </w:p>
+    <w:p>
+      <w:pPr>
+        <w:pStyle w:val="Date"/>
+      </w:pPr>
+      <w:r>
+        <w:t xml:space="preserve">March 2026</w:t>
+      </w:r>
+    </w:p>
+    <w:sdt>
+      <w:sdtPr>
+        <w:docPartObj>
+          <w:docPartGallery w:val="Table of Contents"/>
+          <w:docPartUnique/>
+        </w:docPartObj>
+      </w:sdtPr>
+      <w:sdtContent>
+        <w:p>
+          <w:pPr>
+            <w:pStyle w:val="TOCHeading"/>
+          </w:pPr>
+          <w:r>
+            <w:t xml:space="preserve">Table of Contents</w:t>
+          </w:r>
+        </w:p>
+        <w:p>
+          <w:r>
+            <w:fldChar w:fldCharType="begin" w:dirty="true"/>
+            <w:instrText xml:space="preserve">TOC \o "1-3" \h \z \u</w:instrText>
+            <w:fldChar w:fldCharType="separate"/>
+            <w:fldChar w:fldCharType="end"/>
+          </w:r>
+        </w:p>
+      </w:sdtContent>
+    </w:sdt>
     <w:bookmarkStart w:id="15" w:name="multimedia-appendix-1"/>
     <w:p>
       <w:pPr>
@@ -2273,7 +2323,7 @@
   <w:docDefaults>
     <w:rPrDefault>
       <w:rPr>
-        <w:rFonts w:asciiTheme="minorHAnsi" w:cstheme="minorBidi" w:eastAsiaTheme="minorEastAsia" w:hAnsiTheme="minorHAnsi"/>
+        <w:rFonts w:ascii="Times New Roman" w:cstheme="minorBidi" w:eastAsiaTheme="minorEastAsia" w:hAnsi="Times New Roman"/>
         <w:sz w:val="24"/>
         <w:szCs w:val="24"/>
         <w:lang w:bidi="ar-SA" w:eastAsia="zh-CN" w:val="en-US"/>
@@ -2335,9 +2385,9 @@
       <w:jc w:val="center"/>
     </w:pPr>
     <w:rPr>
-      <w:rFonts w:asciiTheme="majorHAnsi" w:cstheme="majorBidi" w:eastAsiaTheme="majorEastAsia" w:hAnsiTheme="majorHAnsi"/>
-      <w:sz w:val="56"/>
-      <w:szCs w:val="56"/>
+      <w:rFonts w:ascii="Times New Roman" w:cstheme="majorBidi" w:eastAsiaTheme="majorEastAsia" w:hAnsi="Times New Roman"/>
+      <w:sz w:val="28"/>
+      <w:szCs w:val="28"/>
     </w:rPr>
   </w:style>
   <w:style w:customStyle="1" w:styleId="TitleChar" w:type="character">
@@ -2347,9 +2397,9 @@
     <w:uiPriority w:val="10"/>
     <w:rsid w:val="00A10FD9"/>
     <w:rPr>
-      <w:rFonts w:asciiTheme="majorHAnsi" w:cstheme="majorBidi" w:eastAsiaTheme="majorEastAsia" w:hAnsiTheme="majorHAnsi"/>
-      <w:sz w:val="56"/>
-      <w:szCs w:val="56"/>
+      <w:rFonts w:ascii="Times New Roman" w:cstheme="majorBidi" w:eastAsiaTheme="majorEastAsia" w:hAnsi="Times New Roman"/>
+      <w:sz w:val="28"/>
+      <w:szCs w:val="28"/>
     </w:rPr>
   </w:style>
   <w:style w:styleId="Subtitle" w:type="paragraph">
@@ -2366,7 +2416,7 @@
       </w:numPr>
     </w:pPr>
     <w:rPr>
-      <w:rFonts w:cstheme="majorBidi" w:eastAsiaTheme="majorEastAsia"/>
+      <w:rFonts w:ascii="Times New Roman" w:cstheme="majorBidi" w:eastAsiaTheme="majorEastAsia" w:hAnsi="Times New Roman"/>
       <w:spacing w:val="15"/>
       <w:sz w:val="28"/>
       <w:szCs w:val="28"/>
@@ -2379,8 +2429,8 @@
     <w:uiPriority w:val="11"/>
     <w:rsid w:val="00A10FD9"/>
     <w:rPr>
-      <w:rFonts w:cstheme="majorBidi" w:eastAsiaTheme="majorEastAsia"/>
-      <w:color w:themeColor="text1" w:themeTint="A6" w:val="595959"/>
+      <w:rFonts w:ascii="Times New Roman" w:cstheme="majorBidi" w:eastAsiaTheme="majorEastAsia" w:hAnsi="Times New Roman"/>
+      <w:color w:themeTint="A6" w:val="000000"/>
       <w:spacing w:val="15"/>
       <w:sz w:val="28"/>
       <w:szCs w:val="28"/>
@@ -2469,10 +2519,10 @@
       <w:outlineLvl w:val="0"/>
     </w:pPr>
     <w:rPr>
-      <w:rFonts w:asciiTheme="majorHAnsi" w:cstheme="majorBidi" w:eastAsiaTheme="majorEastAsia" w:hAnsiTheme="majorHAnsi"/>
-      <w:color w:themeColor="accent1" w:themeShade="BF" w:val="0F4761"/>
-      <w:sz w:val="40"/>
-      <w:szCs w:val="40"/>
+      <w:rFonts w:ascii="Times New Roman" w:cstheme="majorBidi" w:eastAsiaTheme="majorEastAsia" w:hAnsi="Times New Roman"/>
+      <w:color w:val="000000"/>
+      <w:sz w:val="28"/>
+      <w:szCs w:val="28"/>
     </w:rPr>
   </w:style>
   <w:style w:styleId="Heading2" w:type="paragraph">
@@ -2492,10 +2542,10 @@
       <w:outlineLvl w:val="1"/>
     </w:pPr>
     <w:rPr>
-      <w:rFonts w:asciiTheme="majorHAnsi" w:cstheme="majorBidi" w:eastAsiaTheme="majorEastAsia" w:hAnsiTheme="majorHAnsi"/>
-      <w:color w:themeColor="accent1" w:themeShade="BF" w:val="0F4761"/>
-      <w:sz w:val="32"/>
-      <w:szCs w:val="32"/>
+      <w:rFonts w:ascii="Times New Roman" w:cstheme="majorBidi" w:eastAsiaTheme="majorEastAsia" w:hAnsi="Times New Roman"/>
+      <w:color w:val="000000"/>
+      <w:sz w:val="26"/>
+      <w:szCs w:val="26"/>
     </w:rPr>
   </w:style>
   <w:style w:styleId="Heading3" w:type="paragraph">
@@ -2515,10 +2565,10 @@
       <w:outlineLvl w:val="2"/>
     </w:pPr>
     <w:rPr>
-      <w:rFonts w:cstheme="majorBidi" w:eastAsiaTheme="majorEastAsia"/>
-      <w:color w:themeColor="accent1" w:themeShade="BF" w:val="0F4761"/>
-      <w:sz w:val="28"/>
-      <w:szCs w:val="28"/>
+      <w:rFonts w:ascii="Times New Roman" w:cstheme="majorBidi" w:eastAsiaTheme="majorEastAsia" w:hAnsi="Times New Roman"/>
+      <w:color w:val="000000"/>
+      <w:sz w:val="24"/>
+      <w:szCs w:val="24"/>
     </w:rPr>
   </w:style>
   <w:style w:styleId="Heading4" w:type="paragraph">
@@ -2538,10 +2588,10 @@
       <w:outlineLvl w:val="3"/>
     </w:pPr>
     <w:rPr>
-      <w:rFonts w:cstheme="majorBidi" w:eastAsiaTheme="majorEastAsia"/>
+      <w:rFonts w:ascii="Times New Roman" w:cstheme="majorBidi" w:eastAsiaTheme="majorEastAsia" w:hAnsi="Times New Roman"/>
       <w:i/>
       <w:iCs/>
-      <w:color w:themeColor="accent1" w:themeShade="BF" w:val="0F4761"/>
+      <w:color w:val="000000"/>
     </w:rPr>
   </w:style>
   <w:style w:styleId="Heading5" w:type="paragraph">
@@ -2561,8 +2611,8 @@
       <w:outlineLvl w:val="4"/>
     </w:pPr>
     <w:rPr>
-      <w:rFonts w:cstheme="majorBidi" w:eastAsiaTheme="majorEastAsia"/>
-      <w:color w:themeColor="accent1" w:themeShade="BF" w:val="0F4761"/>
+      <w:rFonts w:ascii="Times New Roman" w:cstheme="majorBidi" w:eastAsiaTheme="majorEastAsia" w:hAnsi="Times New Roman"/>
+      <w:color w:val="000000"/>
     </w:rPr>
   </w:style>
   <w:style w:styleId="Heading6" w:type="paragraph">
@@ -2582,10 +2632,10 @@
       <w:outlineLvl w:val="5"/>
     </w:pPr>
     <w:rPr>
-      <w:rFonts w:cstheme="majorBidi" w:eastAsiaTheme="majorEastAsia"/>
+      <w:rFonts w:ascii="Times New Roman" w:cstheme="majorBidi" w:eastAsiaTheme="majorEastAsia" w:hAnsi="Times New Roman"/>
       <w:i/>
       <w:iCs/>
-      <w:color w:themeColor="text1" w:themeTint="A6" w:val="595959"/>
+      <w:color w:themeTint="A6" w:val="000000"/>
     </w:rPr>
   </w:style>
   <w:style w:styleId="Heading7" w:type="paragraph">
@@ -2605,8 +2655,8 @@
       <w:outlineLvl w:val="6"/>
     </w:pPr>
     <w:rPr>
-      <w:rFonts w:cstheme="majorBidi" w:eastAsiaTheme="majorEastAsia"/>
-      <w:color w:themeColor="text1" w:themeTint="A6" w:val="595959"/>
+      <w:rFonts w:ascii="Times New Roman" w:cstheme="majorBidi" w:eastAsiaTheme="majorEastAsia" w:hAnsi="Times New Roman"/>
+      <w:color w:themeTint="A6" w:val="000000"/>
     </w:rPr>
   </w:style>
   <w:style w:styleId="Heading8" w:type="paragraph">
@@ -2626,10 +2676,10 @@
       <w:outlineLvl w:val="7"/>
     </w:pPr>
     <w:rPr>
-      <w:rFonts w:cstheme="majorBidi" w:eastAsiaTheme="majorEastAsia"/>
+      <w:rFonts w:ascii="Times New Roman" w:cstheme="majorBidi" w:eastAsiaTheme="majorEastAsia" w:hAnsi="Times New Roman"/>
       <w:i/>
       <w:iCs/>
-      <w:color w:themeColor="text1" w:themeTint="D8" w:val="272727"/>
+      <w:color w:themeTint="D8" w:val="000000"/>
     </w:rPr>
   </w:style>
   <w:style w:styleId="Heading9" w:type="paragraph">
@@ -2649,8 +2699,8 @@
       <w:outlineLvl w:val="8"/>
     </w:pPr>
     <w:rPr>
-      <w:rFonts w:cstheme="majorBidi" w:eastAsiaTheme="majorEastAsia"/>
-      <w:color w:themeColor="text1" w:themeTint="D8" w:val="272727"/>
+      <w:rFonts w:ascii="Times New Roman" w:cstheme="majorBidi" w:eastAsiaTheme="majorEastAsia" w:hAnsi="Times New Roman"/>
+      <w:color w:themeTint="D8" w:val="000000"/>
     </w:rPr>
   </w:style>
   <w:style w:customStyle="1" w:styleId="Heading1Char" w:type="character">
@@ -2660,10 +2710,10 @@
     <w:uiPriority w:val="9"/>
     <w:rsid w:val="00A10FD9"/>
     <w:rPr>
-      <w:rFonts w:asciiTheme="majorHAnsi" w:cstheme="majorBidi" w:eastAsiaTheme="majorEastAsia" w:hAnsiTheme="majorHAnsi"/>
-      <w:color w:themeColor="accent1" w:themeShade="BF" w:val="0F4761"/>
-      <w:sz w:val="40"/>
-      <w:szCs w:val="40"/>
+      <w:rFonts w:ascii="Times New Roman" w:cstheme="majorBidi" w:eastAsiaTheme="majorEastAsia" w:hAnsi="Times New Roman"/>
+      <w:color w:val="000000"/>
+      <w:sz w:val="28"/>
+      <w:szCs w:val="28"/>
     </w:rPr>
   </w:style>
   <w:style w:customStyle="1" w:styleId="Heading2Char" w:type="character">
@@ -2674,10 +2724,10 @@
     <w:semiHidden/>
     <w:rsid w:val="00A10FD9"/>
     <w:rPr>
-      <w:rFonts w:asciiTheme="majorHAnsi" w:cstheme="majorBidi" w:eastAsiaTheme="majorEastAsia" w:hAnsiTheme="majorHAnsi"/>
-      <w:color w:themeColor="accent1" w:themeShade="BF" w:val="0F4761"/>
-      <w:sz w:val="32"/>
-      <w:szCs w:val="32"/>
+      <w:rFonts w:ascii="Times New Roman" w:cstheme="majorBidi" w:eastAsiaTheme="majorEastAsia" w:hAnsi="Times New Roman"/>
+      <w:color w:val="000000"/>
+      <w:sz w:val="26"/>
+      <w:szCs w:val="26"/>
     </w:rPr>
   </w:style>
   <w:style w:customStyle="1" w:styleId="Heading3Char" w:type="character">
@@ -2688,10 +2738,10 @@
     <w:semiHidden/>
     <w:rsid w:val="00A10FD9"/>
     <w:rPr>
-      <w:rFonts w:cstheme="majorBidi" w:eastAsiaTheme="majorEastAsia"/>
-      <w:color w:themeColor="accent1" w:themeShade="BF" w:val="0F4761"/>
-      <w:sz w:val="28"/>
-      <w:szCs w:val="28"/>
+      <w:rFonts w:ascii="Times New Roman" w:cstheme="majorBidi" w:eastAsiaTheme="majorEastAsia" w:hAnsi="Times New Roman"/>
+      <w:color w:val="000000"/>
+      <w:sz w:val="24"/>
+      <w:szCs w:val="24"/>
     </w:rPr>
   </w:style>
   <w:style w:customStyle="1" w:styleId="Heading4Char" w:type="character">
@@ -2702,10 +2752,10 @@
     <w:semiHidden/>
     <w:rsid w:val="00A10FD9"/>
     <w:rPr>
-      <w:rFonts w:cstheme="majorBidi" w:eastAsiaTheme="majorEastAsia"/>
+      <w:rFonts w:ascii="Times New Roman" w:cstheme="majorBidi" w:eastAsiaTheme="majorEastAsia" w:hAnsi="Times New Roman"/>
       <w:i/>
       <w:iCs/>
-      <w:color w:themeColor="accent1" w:themeShade="BF" w:val="0F4761"/>
+      <w:color w:val="000000"/>
     </w:rPr>
   </w:style>
   <w:style w:customStyle="1" w:styleId="Heading5Char" w:type="character">
@@ -2716,8 +2766,8 @@
     <w:semiHidden/>
     <w:rsid w:val="00A10FD9"/>
     <w:rPr>
-      <w:rFonts w:cstheme="majorBidi" w:eastAsiaTheme="majorEastAsia"/>
-      <w:color w:themeColor="accent1" w:themeShade="BF" w:val="0F4761"/>
+      <w:rFonts w:ascii="Times New Roman" w:cstheme="majorBidi" w:eastAsiaTheme="majorEastAsia" w:hAnsi="Times New Roman"/>
+      <w:color w:val="000000"/>
     </w:rPr>
   </w:style>
   <w:style w:customStyle="1" w:styleId="Heading6Char" w:type="character">
@@ -2728,10 +2778,10 @@
     <w:semiHidden/>
     <w:rsid w:val="00A10FD9"/>
     <w:rPr>
-      <w:rFonts w:cstheme="majorBidi" w:eastAsiaTheme="majorEastAsia"/>
+      <w:rFonts w:ascii="Times New Roman" w:cstheme="majorBidi" w:eastAsiaTheme="majorEastAsia" w:hAnsi="Times New Roman"/>
       <w:i/>
       <w:iCs/>
-      <w:color w:themeColor="text1" w:themeTint="A6" w:val="595959"/>
+      <w:color w:themeTint="A6" w:val="000000"/>
     </w:rPr>
   </w:style>
   <w:style w:customStyle="1" w:styleId="Heading7Char" w:type="character">
@@ -2742,8 +2792,8 @@
     <w:semiHidden/>
     <w:rsid w:val="00A10FD9"/>
     <w:rPr>
-      <w:rFonts w:cstheme="majorBidi" w:eastAsiaTheme="majorEastAsia"/>
-      <w:color w:themeColor="text1" w:themeTint="A6" w:val="595959"/>
+      <w:rFonts w:ascii="Times New Roman" w:cstheme="majorBidi" w:eastAsiaTheme="majorEastAsia" w:hAnsi="Times New Roman"/>
+      <w:color w:themeTint="A6" w:val="000000"/>
     </w:rPr>
   </w:style>
   <w:style w:customStyle="1" w:styleId="Heading8Char" w:type="character">
@@ -2754,10 +2804,10 @@
     <w:semiHidden/>
     <w:rsid w:val="00A10FD9"/>
     <w:rPr>
-      <w:rFonts w:cstheme="majorBidi" w:eastAsiaTheme="majorEastAsia"/>
+      <w:rFonts w:ascii="Times New Roman" w:cstheme="majorBidi" w:eastAsiaTheme="majorEastAsia" w:hAnsi="Times New Roman"/>
       <w:i/>
       <w:iCs/>
-      <w:color w:themeColor="text1" w:themeTint="D8" w:val="272727"/>
+      <w:color w:themeTint="D8" w:val="000000"/>
     </w:rPr>
   </w:style>
   <w:style w:customStyle="1" w:styleId="Heading9Char" w:type="character">
@@ -2768,8 +2818,8 @@
     <w:semiHidden/>
     <w:rsid w:val="00A10FD9"/>
     <w:rPr>
-      <w:rFonts w:cstheme="majorBidi" w:eastAsiaTheme="majorEastAsia"/>
-      <w:color w:themeColor="text1" w:themeTint="D8" w:val="272727"/>
+      <w:rFonts w:ascii="Times New Roman" w:cstheme="majorBidi" w:eastAsiaTheme="majorEastAsia" w:hAnsi="Times New Roman"/>
+      <w:color w:themeTint="D8" w:val="000000"/>
     </w:rPr>
   </w:style>
   <w:style w:styleId="BlockText" w:type="paragraph">
@@ -2892,7 +2942,7 @@
     <w:name w:val="Verbatim Char"/>
     <w:basedOn w:val="BodyTextChar"/>
     <w:rPr>
-      <w:rFonts w:ascii="Consolas" w:hAnsi="Consolas"/>
+      <w:rFonts w:ascii="Times New Roman" w:hAnsi="Times New Roman"/>
       <w:sz w:val="22"/>
     </w:rPr>
   </w:style>
@@ -2911,7 +2961,7 @@
     <w:name w:val="Hyperlink"/>
     <w:basedOn w:val="BodyTextChar"/>
     <w:rPr>
-      <w:color w:themeColor="accent1" w:val="4F81BD"/>
+      <w:color w:val="000000"/>
     </w:rPr>
   </w:style>
   <w:style w:styleId="TOCHeading" w:type="paragraph">
@@ -2926,10 +2976,10 @@
       <w:outlineLvl w:val="9"/>
     </w:pPr>
     <w:rPr>
-      <w:rFonts w:asciiTheme="majorHAnsi" w:cstheme="majorBidi" w:eastAsiaTheme="majorEastAsia" w:hAnsiTheme="majorHAnsi"/>
+      <w:rFonts w:ascii="Times New Roman" w:cstheme="majorBidi" w:eastAsiaTheme="majorEastAsia" w:hAnsi="Times New Roman"/>
       <w:b w:val="0"/>
       <w:bCs w:val="0"/>
-      <w:color w:themeColor="accent1" w:themeShade="BF" w:val="365F91"/>
+      <w:color w:val="000000"/>
     </w:rPr>
   </w:style>
   <w:style w:type="paragraph" w:customStyle="1" w:styleId="SourceCode">

</xml_diff>

<commit_message>
fix(paper): convert all bold emphasis to italics per JMIR formatting
JMIR requires "italics, rather than underlining or bold as emphasis."
Converted all **text** to *text* in both paper.md and
multimedia_appendix_1.md. All artifacts rebuilt.

Refs #506

Co-Authored-By: Claude Opus 4.6 (1M context) <noreply@anthropic.com>
</commit_message>
<xml_diff>
--- a/multimedia_appendix_1.docx
+++ b/multimedia_appendix_1.docx
@@ -82,8 +82,8 @@
       </w:r>
       <w:r>
         <w:rPr>
-          <w:b/>
-          <w:bCs/>
+          <w:i/>
+          <w:iCs/>
         </w:rPr>
         <w:t xml:space="preserve">Natural Language Intent</w:t>
       </w:r>
@@ -95,8 +95,8 @@
       </w:r>
       <w:r>
         <w:rPr>
-          <w:b/>
-          <w:bCs/>
+          <w:i/>
+          <w:iCs/>
         </w:rPr>
         <w:t xml:space="preserve">Executable SQL</w:t>
       </w:r>
@@ -108,8 +108,8 @@
       </w:r>
       <w:r>
         <w:rPr>
-          <w:b/>
-          <w:bCs/>
+          <w:i/>
+          <w:iCs/>
         </w:rPr>
         <w:t xml:space="preserve">Rationale Metadata</w:t>
       </w:r>
@@ -183,8 +183,8 @@
       </w:pPr>
       <w:r>
         <w:rPr>
-          <w:b/>
-          <w:bCs/>
+          <w:i/>
+          <w:iCs/>
         </w:rPr>
         <w:t xml:space="preserve">Natural Language Intent:</w:t>
       </w:r>
@@ -201,8 +201,8 @@
       </w:pPr>
       <w:r>
         <w:rPr>
-          <w:b/>
-          <w:bCs/>
+          <w:i/>
+          <w:iCs/>
         </w:rPr>
         <w:t xml:space="preserve">Executable SQL:</w:t>
       </w:r>
@@ -527,8 +527,8 @@
       </w:pPr>
       <w:r>
         <w:rPr>
-          <w:b/>
-          <w:bCs/>
+          <w:i/>
+          <w:iCs/>
         </w:rPr>
         <w:t xml:space="preserve">Rationale Metadata:</w:t>
       </w:r>
@@ -562,8 +562,8 @@
       </w:pPr>
       <w:r>
         <w:rPr>
-          <w:b/>
-          <w:bCs/>
+          <w:i/>
+          <w:iCs/>
         </w:rPr>
         <w:t xml:space="preserve">Natural Language Intent:</w:t>
       </w:r>
@@ -580,8 +580,8 @@
       </w:pPr>
       <w:r>
         <w:rPr>
-          <w:b/>
-          <w:bCs/>
+          <w:i/>
+          <w:iCs/>
         </w:rPr>
         <w:t xml:space="preserve">Executable SQL:</w:t>
       </w:r>
@@ -1560,8 +1560,8 @@
       </w:pPr>
       <w:r>
         <w:rPr>
-          <w:b/>
-          <w:bCs/>
+          <w:i/>
+          <w:iCs/>
         </w:rPr>
         <w:t xml:space="preserve">Rationale Metadata:</w:t>
       </w:r>
@@ -1604,8 +1604,8 @@
       </w:pPr>
       <w:r>
         <w:rPr>
-          <w:b/>
-          <w:bCs/>
+          <w:i/>
+          <w:iCs/>
         </w:rPr>
         <w:t xml:space="preserve">Natural Language Intent:</w:t>
       </w:r>
@@ -1622,8 +1622,8 @@
       </w:pPr>
       <w:r>
         <w:rPr>
-          <w:b/>
-          <w:bCs/>
+          <w:i/>
+          <w:iCs/>
         </w:rPr>
         <w:t xml:space="preserve">Executable SQL:</w:t>
       </w:r>
@@ -2005,8 +2005,8 @@
       </w:pPr>
       <w:r>
         <w:rPr>
-          <w:b/>
-          <w:bCs/>
+          <w:i/>
+          <w:iCs/>
         </w:rPr>
         <w:t xml:space="preserve">Rationale Metadata:</w:t>
       </w:r>

</xml_diff>

<commit_message>
fix(paper): use Unicode right arrow in Table 1 DIKW column
User-approved exception to ASCII-only: replace ASCII '->' with
U+2192 in the framework-alignment table. Verified glyph renders
in xelatex PDF and DOCX.

Co-Authored-By: Claude Fable 5 <noreply@anthropic.com>
</commit_message>
<xml_diff>
--- a/multimedia_appendix_1.docx
+++ b/multimedia_appendix_1.docx
@@ -7,7 +7,7 @@
         <w:pStyle w:val="Title"/>
       </w:pPr>
       <w:r>
-        <w:t xml:space="preserve">Healthcare Analytics Challenges: A Three-Pillar Framework Connecting Analytics Maturity, Workforce Agility, and Technical Enablement</w:t>
+        <w:t xml:space="preserve">Multimedia Appendix</w:t>
       </w:r>
     </w:p>
     <w:p>
@@ -23,7 +23,7 @@
         <w:pStyle w:val="Date"/>
       </w:pPr>
       <w:r>
-        <w:t xml:space="preserve">March 2026</w:t>
+        <w:t xml:space="preserve">June 2026</w:t>
       </w:r>
     </w:p>
     <w:sdt>
@@ -75,7 +75,16 @@
         <w:pStyle w:val="FirstParagraph"/>
       </w:pPr>
       <w:r>
-        <w:t xml:space="preserve">This appendix illustrates the Validated Query Triple artifact proposed by the HITL-KG framework (see Section 2.2 of the main paper). Each triple comprises three components: (1)</w:t>
+        <w:t xml:space="preserve">This appendix illustrates the Validated Query Triple artifact proposed by the HITL-KG framework (see the main paper’s section</w:t>
+      </w:r>
+      <w:r>
+        <w:t xml:space="preserve"> </w:t>
+      </w:r>
+      <w:r>
+        <w:t xml:space="preserve">“The Solution: Externalization via Socio-Technical Artifacts”</w:t>
+      </w:r>
+      <w:r>
+        <w:t xml:space="preserve">). Each triple comprises three components: (1)</w:t>
       </w:r>
       <w:r>
         <w:t xml:space="preserve"> </w:t>
@@ -2474,7 +2483,7 @@
   <w:docDefaults>
     <w:rPrDefault>
       <w:rPr>
-        <w:rFonts w:asciiTheme="minorHAnsi" w:cstheme="minorBidi" w:eastAsiaTheme="minorEastAsia" w:hAnsiTheme="minorHAnsi"/>
+        <w:rFonts w:ascii="Times New Roman" w:cstheme="minorBidi" w:eastAsiaTheme="minorEastAsia" w:hAnsi="Times New Roman"/>
         <w:sz w:val="24"/>
         <w:szCs w:val="24"/>
         <w:lang w:bidi="ar-SA" w:eastAsia="zh-CN" w:val="en-US"/>
@@ -2488,8 +2497,16 @@
   </w:docDefaults>
   <w:latentStyles w:count="276" w:defLockedState="0" w:defQFormat="0" w:defSemiHidden="0" w:defUIPriority="0" w:defUnhideWhenUsed="0"/>
   <w:style w:default="1" w:styleId="Normal" w:type="paragraph">
+    <w:pPr>
+      <w:spacing w:after="0" w:line="480" w:lineRule="auto"/>
+    </w:pPr>
     <w:name w:val="Normal"/>
     <w:qFormat/>
+    <w:rPr>
+      <w:rFonts w:ascii="Times New Roman" w:hAnsi="Times New Roman"/>
+      <w:sz w:val="24"/>
+      <w:szCs w:val="24"/>
+    </w:rPr>
   </w:style>
   <w:style w:styleId="BodyText" w:type="paragraph">
     <w:name w:val="Body Text"/>
@@ -2528,9 +2545,9 @@
       <w:jc w:val="center"/>
     </w:pPr>
     <w:rPr>
-      <w:rFonts w:asciiTheme="majorHAnsi" w:cstheme="majorBidi" w:eastAsiaTheme="majorEastAsia" w:hAnsiTheme="majorHAnsi"/>
-      <w:sz w:val="56"/>
-      <w:szCs w:val="56"/>
+      <w:rFonts w:ascii="Times New Roman" w:cstheme="majorBidi" w:eastAsiaTheme="majorEastAsia" w:hAnsi="Times New Roman"/>
+      <w:sz w:val="28"/>
+      <w:szCs w:val="28"/>
     </w:rPr>
   </w:style>
   <w:style w:customStyle="1" w:styleId="TitleChar" w:type="character">
@@ -2540,9 +2557,9 @@
     <w:uiPriority w:val="10"/>
     <w:rsid w:val="00A10FD9"/>
     <w:rPr>
-      <w:rFonts w:asciiTheme="majorHAnsi" w:cstheme="majorBidi" w:eastAsiaTheme="majorEastAsia" w:hAnsiTheme="majorHAnsi"/>
-      <w:sz w:val="56"/>
-      <w:szCs w:val="56"/>
+      <w:rFonts w:ascii="Times New Roman" w:cstheme="majorBidi" w:eastAsiaTheme="majorEastAsia" w:hAnsi="Times New Roman"/>
+      <w:sz w:val="28"/>
+      <w:szCs w:val="28"/>
     </w:rPr>
   </w:style>
   <w:style w:styleId="Subtitle" w:type="paragraph">
@@ -2559,7 +2576,7 @@
       </w:numPr>
     </w:pPr>
     <w:rPr>
-      <w:rFonts w:cstheme="majorBidi" w:eastAsiaTheme="majorEastAsia"/>
+      <w:rFonts w:ascii="Times New Roman" w:cstheme="majorBidi" w:eastAsiaTheme="majorEastAsia" w:hAnsi="Times New Roman"/>
       <w:spacing w:val="15"/>
       <w:sz w:val="28"/>
       <w:szCs w:val="28"/>
@@ -2572,8 +2589,8 @@
     <w:uiPriority w:val="11"/>
     <w:rsid w:val="00A10FD9"/>
     <w:rPr>
-      <w:rFonts w:cstheme="majorBidi" w:eastAsiaTheme="majorEastAsia"/>
-      <w:color w:themeColor="text1" w:themeTint="A6" w:val="595959"/>
+      <w:rFonts w:ascii="Times New Roman" w:cstheme="majorBidi" w:eastAsiaTheme="majorEastAsia" w:hAnsi="Times New Roman"/>
+      <w:color w:themeTint="A6" w:val="000000"/>
       <w:spacing w:val="15"/>
       <w:sz w:val="28"/>
       <w:szCs w:val="28"/>
@@ -2662,10 +2679,10 @@
       <w:outlineLvl w:val="0"/>
     </w:pPr>
     <w:rPr>
-      <w:rFonts w:asciiTheme="majorHAnsi" w:cstheme="majorBidi" w:eastAsiaTheme="majorEastAsia" w:hAnsiTheme="majorHAnsi"/>
-      <w:color w:themeColor="accent1" w:themeShade="BF" w:val="0F4761"/>
-      <w:sz w:val="40"/>
-      <w:szCs w:val="40"/>
+      <w:rFonts w:ascii="Times New Roman" w:cstheme="majorBidi" w:eastAsiaTheme="majorEastAsia" w:hAnsi="Times New Roman"/>
+      <w:color w:val="000000"/>
+      <w:sz w:val="28"/>
+      <w:szCs w:val="28"/>
     </w:rPr>
   </w:style>
   <w:style w:styleId="Heading2" w:type="paragraph">
@@ -2685,10 +2702,10 @@
       <w:outlineLvl w:val="1"/>
     </w:pPr>
     <w:rPr>
-      <w:rFonts w:asciiTheme="majorHAnsi" w:cstheme="majorBidi" w:eastAsiaTheme="majorEastAsia" w:hAnsiTheme="majorHAnsi"/>
-      <w:color w:themeColor="accent1" w:themeShade="BF" w:val="0F4761"/>
-      <w:sz w:val="32"/>
-      <w:szCs w:val="32"/>
+      <w:rFonts w:ascii="Times New Roman" w:cstheme="majorBidi" w:eastAsiaTheme="majorEastAsia" w:hAnsi="Times New Roman"/>
+      <w:color w:val="000000"/>
+      <w:sz w:val="26"/>
+      <w:szCs w:val="26"/>
     </w:rPr>
   </w:style>
   <w:style w:styleId="Heading3" w:type="paragraph">
@@ -2708,10 +2725,10 @@
       <w:outlineLvl w:val="2"/>
     </w:pPr>
     <w:rPr>
-      <w:rFonts w:cstheme="majorBidi" w:eastAsiaTheme="majorEastAsia"/>
-      <w:color w:themeColor="accent1" w:themeShade="BF" w:val="0F4761"/>
-      <w:sz w:val="28"/>
-      <w:szCs w:val="28"/>
+      <w:rFonts w:ascii="Times New Roman" w:cstheme="majorBidi" w:eastAsiaTheme="majorEastAsia" w:hAnsi="Times New Roman"/>
+      <w:color w:val="000000"/>
+      <w:sz w:val="24"/>
+      <w:szCs w:val="24"/>
     </w:rPr>
   </w:style>
   <w:style w:styleId="Heading4" w:type="paragraph">
@@ -2731,10 +2748,10 @@
       <w:outlineLvl w:val="3"/>
     </w:pPr>
     <w:rPr>
-      <w:rFonts w:cstheme="majorBidi" w:eastAsiaTheme="majorEastAsia"/>
+      <w:rFonts w:ascii="Times New Roman" w:cstheme="majorBidi" w:eastAsiaTheme="majorEastAsia" w:hAnsi="Times New Roman"/>
       <w:i/>
       <w:iCs/>
-      <w:color w:themeColor="accent1" w:themeShade="BF" w:val="0F4761"/>
+      <w:color w:val="000000"/>
     </w:rPr>
   </w:style>
   <w:style w:styleId="Heading5" w:type="paragraph">
@@ -2754,8 +2771,8 @@
       <w:outlineLvl w:val="4"/>
     </w:pPr>
     <w:rPr>
-      <w:rFonts w:cstheme="majorBidi" w:eastAsiaTheme="majorEastAsia"/>
-      <w:color w:themeColor="accent1" w:themeShade="BF" w:val="0F4761"/>
+      <w:rFonts w:ascii="Times New Roman" w:cstheme="majorBidi" w:eastAsiaTheme="majorEastAsia" w:hAnsi="Times New Roman"/>
+      <w:color w:val="000000"/>
     </w:rPr>
   </w:style>
   <w:style w:styleId="Heading6" w:type="paragraph">
@@ -2775,10 +2792,10 @@
       <w:outlineLvl w:val="5"/>
     </w:pPr>
     <w:rPr>
-      <w:rFonts w:cstheme="majorBidi" w:eastAsiaTheme="majorEastAsia"/>
+      <w:rFonts w:ascii="Times New Roman" w:cstheme="majorBidi" w:eastAsiaTheme="majorEastAsia" w:hAnsi="Times New Roman"/>
       <w:i/>
       <w:iCs/>
-      <w:color w:themeColor="text1" w:themeTint="A6" w:val="595959"/>
+      <w:color w:themeTint="A6" w:val="000000"/>
     </w:rPr>
   </w:style>
   <w:style w:styleId="Heading7" w:type="paragraph">
@@ -2798,8 +2815,8 @@
       <w:outlineLvl w:val="6"/>
     </w:pPr>
     <w:rPr>
-      <w:rFonts w:cstheme="majorBidi" w:eastAsiaTheme="majorEastAsia"/>
-      <w:color w:themeColor="text1" w:themeTint="A6" w:val="595959"/>
+      <w:rFonts w:ascii="Times New Roman" w:cstheme="majorBidi" w:eastAsiaTheme="majorEastAsia" w:hAnsi="Times New Roman"/>
+      <w:color w:themeTint="A6" w:val="000000"/>
     </w:rPr>
   </w:style>
   <w:style w:styleId="Heading8" w:type="paragraph">
@@ -2819,10 +2836,10 @@
       <w:outlineLvl w:val="7"/>
     </w:pPr>
     <w:rPr>
-      <w:rFonts w:cstheme="majorBidi" w:eastAsiaTheme="majorEastAsia"/>
+      <w:rFonts w:ascii="Times New Roman" w:cstheme="majorBidi" w:eastAsiaTheme="majorEastAsia" w:hAnsi="Times New Roman"/>
       <w:i/>
       <w:iCs/>
-      <w:color w:themeColor="text1" w:themeTint="D8" w:val="272727"/>
+      <w:color w:themeTint="D8" w:val="000000"/>
     </w:rPr>
   </w:style>
   <w:style w:styleId="Heading9" w:type="paragraph">
@@ -2842,8 +2859,8 @@
       <w:outlineLvl w:val="8"/>
     </w:pPr>
     <w:rPr>
-      <w:rFonts w:cstheme="majorBidi" w:eastAsiaTheme="majorEastAsia"/>
-      <w:color w:themeColor="text1" w:themeTint="D8" w:val="272727"/>
+      <w:rFonts w:ascii="Times New Roman" w:cstheme="majorBidi" w:eastAsiaTheme="majorEastAsia" w:hAnsi="Times New Roman"/>
+      <w:color w:themeTint="D8" w:val="000000"/>
     </w:rPr>
   </w:style>
   <w:style w:customStyle="1" w:styleId="Heading1Char" w:type="character">
@@ -2853,10 +2870,10 @@
     <w:uiPriority w:val="9"/>
     <w:rsid w:val="00A10FD9"/>
     <w:rPr>
-      <w:rFonts w:asciiTheme="majorHAnsi" w:cstheme="majorBidi" w:eastAsiaTheme="majorEastAsia" w:hAnsiTheme="majorHAnsi"/>
-      <w:color w:themeColor="accent1" w:themeShade="BF" w:val="0F4761"/>
-      <w:sz w:val="40"/>
-      <w:szCs w:val="40"/>
+      <w:rFonts w:ascii="Times New Roman" w:cstheme="majorBidi" w:eastAsiaTheme="majorEastAsia" w:hAnsi="Times New Roman"/>
+      <w:color w:val="000000"/>
+      <w:sz w:val="28"/>
+      <w:szCs w:val="28"/>
     </w:rPr>
   </w:style>
   <w:style w:customStyle="1" w:styleId="Heading2Char" w:type="character">
@@ -2867,10 +2884,10 @@
     <w:semiHidden/>
     <w:rsid w:val="00A10FD9"/>
     <w:rPr>
-      <w:rFonts w:asciiTheme="majorHAnsi" w:cstheme="majorBidi" w:eastAsiaTheme="majorEastAsia" w:hAnsiTheme="majorHAnsi"/>
-      <w:color w:themeColor="accent1" w:themeShade="BF" w:val="0F4761"/>
-      <w:sz w:val="32"/>
-      <w:szCs w:val="32"/>
+      <w:rFonts w:ascii="Times New Roman" w:cstheme="majorBidi" w:eastAsiaTheme="majorEastAsia" w:hAnsi="Times New Roman"/>
+      <w:color w:val="000000"/>
+      <w:sz w:val="26"/>
+      <w:szCs w:val="26"/>
     </w:rPr>
   </w:style>
   <w:style w:customStyle="1" w:styleId="Heading3Char" w:type="character">
@@ -2881,10 +2898,10 @@
     <w:semiHidden/>
     <w:rsid w:val="00A10FD9"/>
     <w:rPr>
-      <w:rFonts w:cstheme="majorBidi" w:eastAsiaTheme="majorEastAsia"/>
-      <w:color w:themeColor="accent1" w:themeShade="BF" w:val="0F4761"/>
-      <w:sz w:val="28"/>
-      <w:szCs w:val="28"/>
+      <w:rFonts w:ascii="Times New Roman" w:cstheme="majorBidi" w:eastAsiaTheme="majorEastAsia" w:hAnsi="Times New Roman"/>
+      <w:color w:val="000000"/>
+      <w:sz w:val="24"/>
+      <w:szCs w:val="24"/>
     </w:rPr>
   </w:style>
   <w:style w:customStyle="1" w:styleId="Heading4Char" w:type="character">
@@ -2895,10 +2912,10 @@
     <w:semiHidden/>
     <w:rsid w:val="00A10FD9"/>
     <w:rPr>
-      <w:rFonts w:cstheme="majorBidi" w:eastAsiaTheme="majorEastAsia"/>
+      <w:rFonts w:ascii="Times New Roman" w:cstheme="majorBidi" w:eastAsiaTheme="majorEastAsia" w:hAnsi="Times New Roman"/>
       <w:i/>
       <w:iCs/>
-      <w:color w:themeColor="accent1" w:themeShade="BF" w:val="0F4761"/>
+      <w:color w:val="000000"/>
     </w:rPr>
   </w:style>
   <w:style w:customStyle="1" w:styleId="Heading5Char" w:type="character">
@@ -2909,8 +2926,8 @@
     <w:semiHidden/>
     <w:rsid w:val="00A10FD9"/>
     <w:rPr>
-      <w:rFonts w:cstheme="majorBidi" w:eastAsiaTheme="majorEastAsia"/>
-      <w:color w:themeColor="accent1" w:themeShade="BF" w:val="0F4761"/>
+      <w:rFonts w:ascii="Times New Roman" w:cstheme="majorBidi" w:eastAsiaTheme="majorEastAsia" w:hAnsi="Times New Roman"/>
+      <w:color w:val="000000"/>
     </w:rPr>
   </w:style>
   <w:style w:customStyle="1" w:styleId="Heading6Char" w:type="character">
@@ -2921,10 +2938,10 @@
     <w:semiHidden/>
     <w:rsid w:val="00A10FD9"/>
     <w:rPr>
-      <w:rFonts w:cstheme="majorBidi" w:eastAsiaTheme="majorEastAsia"/>
+      <w:rFonts w:ascii="Times New Roman" w:cstheme="majorBidi" w:eastAsiaTheme="majorEastAsia" w:hAnsi="Times New Roman"/>
       <w:i/>
       <w:iCs/>
-      <w:color w:themeColor="text1" w:themeTint="A6" w:val="595959"/>
+      <w:color w:themeTint="A6" w:val="000000"/>
     </w:rPr>
   </w:style>
   <w:style w:customStyle="1" w:styleId="Heading7Char" w:type="character">
@@ -2935,8 +2952,8 @@
     <w:semiHidden/>
     <w:rsid w:val="00A10FD9"/>
     <w:rPr>
-      <w:rFonts w:cstheme="majorBidi" w:eastAsiaTheme="majorEastAsia"/>
-      <w:color w:themeColor="text1" w:themeTint="A6" w:val="595959"/>
+      <w:rFonts w:ascii="Times New Roman" w:cstheme="majorBidi" w:eastAsiaTheme="majorEastAsia" w:hAnsi="Times New Roman"/>
+      <w:color w:themeTint="A6" w:val="000000"/>
     </w:rPr>
   </w:style>
   <w:style w:customStyle="1" w:styleId="Heading8Char" w:type="character">
@@ -2947,10 +2964,10 @@
     <w:semiHidden/>
     <w:rsid w:val="00A10FD9"/>
     <w:rPr>
-      <w:rFonts w:cstheme="majorBidi" w:eastAsiaTheme="majorEastAsia"/>
+      <w:rFonts w:ascii="Times New Roman" w:cstheme="majorBidi" w:eastAsiaTheme="majorEastAsia" w:hAnsi="Times New Roman"/>
       <w:i/>
       <w:iCs/>
-      <w:color w:themeColor="text1" w:themeTint="D8" w:val="272727"/>
+      <w:color w:themeTint="D8" w:val="000000"/>
     </w:rPr>
   </w:style>
   <w:style w:customStyle="1" w:styleId="Heading9Char" w:type="character">
@@ -2961,8 +2978,8 @@
     <w:semiHidden/>
     <w:rsid w:val="00A10FD9"/>
     <w:rPr>
-      <w:rFonts w:cstheme="majorBidi" w:eastAsiaTheme="majorEastAsia"/>
-      <w:color w:themeColor="text1" w:themeTint="D8" w:val="272727"/>
+      <w:rFonts w:ascii="Times New Roman" w:cstheme="majorBidi" w:eastAsiaTheme="majorEastAsia" w:hAnsi="Times New Roman"/>
+      <w:color w:themeTint="D8" w:val="000000"/>
     </w:rPr>
   </w:style>
   <w:style w:styleId="BlockText" w:type="paragraph">
@@ -3085,7 +3102,7 @@
     <w:name w:val="Verbatim Char"/>
     <w:basedOn w:val="BodyTextChar"/>
     <w:rPr>
-      <w:rFonts w:ascii="Consolas" w:hAnsi="Consolas"/>
+      <w:rFonts w:ascii="Times New Roman" w:hAnsi="Times New Roman"/>
       <w:sz w:val="22"/>
     </w:rPr>
   </w:style>
@@ -3104,7 +3121,7 @@
     <w:name w:val="Hyperlink"/>
     <w:basedOn w:val="BodyTextChar"/>
     <w:rPr>
-      <w:color w:themeColor="accent1" w:val="4F81BD"/>
+      <w:color w:val="000000"/>
     </w:rPr>
   </w:style>
   <w:style w:styleId="TOCHeading" w:type="paragraph">
@@ -3119,10 +3136,10 @@
       <w:outlineLvl w:val="9"/>
     </w:pPr>
     <w:rPr>
-      <w:rFonts w:asciiTheme="majorHAnsi" w:cstheme="majorBidi" w:eastAsiaTheme="majorEastAsia" w:hAnsiTheme="majorHAnsi"/>
+      <w:rFonts w:ascii="Times New Roman" w:cstheme="majorBidi" w:eastAsiaTheme="majorEastAsia" w:hAnsi="Times New Roman"/>
       <w:b w:val="0"/>
       <w:bCs w:val="0"/>
-      <w:color w:themeColor="accent1" w:themeShade="BF" w:val="365F91"/>
+      <w:color w:val="000000"/>
     </w:rPr>
   </w:style>
   <w:style w:type="paragraph" w:customStyle="1" w:styleId="SourceCode">

</xml_diff>

<commit_message>
fix(paper): remove table of contents for JMIR submission
A document TOC is not part of the JMIR/i-JMR manuscript format (their
template has none) and is stripped on acceptance. Set toc:false in both
paper.md frontmatter and metadata.yaml; manuscript now opens at the
Abstract. Verified TOC absent from rebuilt DOCX/PDF with no regressions
(bracket citations, unnumbered headings, figures intact).

Co-Authored-By: Claude Fable 5 <noreply@anthropic.com>
</commit_message>
<xml_diff>
--- a/multimedia_appendix_1.docx
+++ b/multimedia_appendix_1.docx
@@ -26,32 +26,6 @@
         <w:t xml:space="preserve">June 2026</w:t>
       </w:r>
     </w:p>
-    <w:sdt>
-      <w:sdtPr>
-        <w:docPartObj>
-          <w:docPartGallery w:val="Table of Contents"/>
-          <w:docPartUnique/>
-        </w:docPartObj>
-      </w:sdtPr>
-      <w:sdtContent>
-        <w:p>
-          <w:pPr>
-            <w:pStyle w:val="TOCHeading"/>
-          </w:pPr>
-          <w:r>
-            <w:t xml:space="preserve">Table of Contents</w:t>
-          </w:r>
-        </w:p>
-        <w:p>
-          <w:r>
-            <w:fldChar w:fldCharType="begin" w:dirty="true"/>
-            <w:instrText xml:space="preserve">TOC \o "1-3" \h \z \u</w:instrText>
-            <w:fldChar w:fldCharType="separate"/>
-            <w:fldChar w:fldCharType="end"/>
-          </w:r>
-        </w:p>
-      </w:sdtContent>
-    </w:sdt>
     <w:bookmarkStart w:id="16" w:name="multimedia-appendix-1"/>
     <w:p>
       <w:pPr>

</xml_diff>